<commit_message>
v7.1.0: RECON, discovery, adapter tools, DHCP alias/batch, report, fuses
</commit_message>
<xml_diff>
--- a/assets/NET-ETHER-Guide.docx
+++ b/assets/NET-ETHER-Guide.docx
@@ -57,7 +57,7 @@
           <w:sz w:val="22"/>
           <w:szCs w:val="22"/>
         </w:rPr>
-        <w:t xml:space="preserve">Application version 7.0.0 · Document version 4.0</w:t>
+        <w:t xml:space="preserve">Application version 7.1.0 · Document version 5.0</w:t>
       </w:r>
     </w:p>
     <w:p>
@@ -120,7 +120,7 @@
           <w:sz w:val="22"/>
           <w:szCs w:val="22"/>
         </w:rPr>
-        <w:t xml:space="preserve">NET//ETHER is a compact, always-on-top Windows tool for low-voltage field technicians. It does five things fast: switches the laptop's wired adapter between IP configurations, serves DHCP to devices that need an address, monitors connectivity, scans a subnet to see what's there, and remembers what was found at each site so the next visit starts with knowledge instead of guesswork.</w:t>
+        <w:t xml:space="preserve">NET//ETHER is a compact, always-on-top Windows tool for low-voltage field technicians. It does six things fast: switches the laptop's wired adapter between IP configurations, serves DHCP to devices that need an address, monitors connectivity, scans a subnet to see what's there, listens to a port to learn what it is before you say anything, and remembers what was found at each site so the next visit starts with knowledge instead of guesswork.</w:t>
       </w:r>
     </w:p>
     <w:p>
@@ -133,7 +133,7 @@
           <w:sz w:val="22"/>
           <w:szCs w:val="22"/>
         </w:rPr>
-        <w:t xml:space="preserve">Version 7 absorbs NET//DHCP. The standalone DHCP tool is now the DHCP tab — one application, one installer, one thing for IT to approve.</w:t>
+        <w:t xml:space="preserve">Version 7 absorbed NET//DHCP; 7.1 adds RECON, multicast discovery, link speed, a Wi-Fi switch, port blinking, Wake-on-LAN and a site report. One application, one installer, signed.</w:t>
       </w:r>
     </w:p>
     <w:p>
@@ -277,7 +277,7 @@
       </w:tr>
       <w:tr>
         <w:trPr>
-          <w:tblHeader w:val="false"/>
+          <w:tblHeader w:val="off"/>
         </w:trPr>
         <w:tc>
           <w:tcPr>
@@ -334,7 +334,7 @@
       </w:tr>
       <w:tr>
         <w:trPr>
-          <w:tblHeader w:val="false"/>
+          <w:tblHeader w:val="off"/>
         </w:trPr>
         <w:tc>
           <w:tcPr>
@@ -358,7 +358,7 @@
                 <w:sz w:val="20"/>
                 <w:szCs w:val="20"/>
               </w:rPr>
-              <w:t xml:space="preserve">Version chip (e.g. v7.0.0)</w:t>
+              <w:t xml:space="preserve">Version chip (e.g. v7.1.0)</w:t>
             </w:r>
           </w:p>
         </w:tc>
@@ -384,14 +384,14 @@
                 <w:sz w:val="20"/>
                 <w:szCs w:val="20"/>
               </w:rPr>
-              <w:t xml:space="preserve">Opens a small menu: DIAGNOSTICS, and FIT WINDOW to snap the HUD to its content. Turns amber if the app is not running elevated.</w:t>
+              <w:t xml:space="preserve">Opens a small menu: DIAGNOSTICS, FIT WINDOW to snap the HUD to its content, and SITE REPORT, which copies a markdown summary of everything this session did (adapter, scans, RECON, DHCP, ping, every privileged command) for the ticket. Turns amber if the app is not running elevated.</w:t>
             </w:r>
           </w:p>
         </w:tc>
       </w:tr>
       <w:tr>
         <w:trPr>
-          <w:tblHeader w:val="false"/>
+          <w:tblHeader w:val="off"/>
         </w:trPr>
         <w:tc>
           <w:tcPr>
@@ -448,7 +448,7 @@
       </w:tr>
       <w:tr>
         <w:trPr>
-          <w:tblHeader w:val="false"/>
+          <w:tblHeader w:val="off"/>
         </w:trPr>
         <w:tc>
           <w:tcPr>
@@ -505,7 +505,7 @@
       </w:tr>
       <w:tr>
         <w:trPr>
-          <w:tblHeader w:val="false"/>
+          <w:tblHeader w:val="off"/>
         </w:trPr>
         <w:tc>
           <w:tcPr>
@@ -562,7 +562,7 @@
       </w:tr>
       <w:tr>
         <w:trPr>
-          <w:tblHeader w:val="false"/>
+          <w:tblHeader w:val="off"/>
         </w:trPr>
         <w:tc>
           <w:tcPr>
@@ -619,7 +619,7 @@
       </w:tr>
       <w:tr>
         <w:trPr>
-          <w:tblHeader w:val="false"/>
+          <w:tblHeader w:val="off"/>
         </w:trPr>
         <w:tc>
           <w:tcPr>
@@ -669,7 +669,7 @@
                 <w:sz w:val="20"/>
                 <w:szCs w:val="20"/>
               </w:rPr>
-              <w:t xml:space="preserve">Quit. If you changed any adapter this session you're offered a one-click restore first. Any DHCP serving is shut down cleanly.</w:t>
+              <w:t xml:space="preserve">Quit. If a Multi-IP is still on an adapter you're warned first (press ✕ again to quit anyway); if you changed any adapter this session you're offered a one-click restore. DHCP serving, temporary link-local aliases and RECON's adapter bindings are all put back before the app exits.</w:t>
             </w:r>
           </w:p>
         </w:tc>
@@ -712,25 +712,25 @@
           <w:sz w:val="22"/>
           <w:szCs w:val="22"/>
         </w:rPr>
-        <w:t xml:space="preserve">The window fits itself to the active tab. Drag it taller and that size holds until you switch tabs; lists stretch to fill the extra room. FIT WINDOW in the version-chip menu snaps it back.</w:t>
-      </w:r>
-    </w:p>
-    <w:p>
-      <w:pPr>
-        <w:pStyle w:val="ListParagraph"/>
-        <w:numPr>
-          <w:ilvl w:val="0"/>
-          <w:numId w:val="2"/>
-        </w:numPr>
-        <w:spacing w:after="80" w:line="276"/>
-      </w:pPr>
-      <w:r>
-        <w:rPr>
-          <w:rFonts w:ascii="Calibri" w:cs="Calibri" w:eastAsia="Calibri" w:hAnsi="Calibri"/>
-          <w:sz w:val="22"/>
-          <w:szCs w:val="22"/>
-        </w:rPr>
-        <w:t xml:space="preserve">DHCP is the wide tab: the window grows to about 820 px while it's open and returns to your normal width when you leave.</w:t>
+        <w:t xml:space="preserve">The window fits itself to the active tab. Drag it taller and that size holds until you switch tabs; lists stretch to fill the extra room. FIT WINDOW in the version-chip menu snaps it back. If a tab needs more height than there is room below, the window moves up rather than hanging off the bottom.</w:t>
+      </w:r>
+    </w:p>
+    <w:p>
+      <w:pPr>
+        <w:pStyle w:val="ListParagraph"/>
+        <w:numPr>
+          <w:ilvl w:val="0"/>
+          <w:numId w:val="2"/>
+        </w:numPr>
+        <w:spacing w:after="80" w:line="276"/>
+      </w:pPr>
+      <w:r>
+        <w:rPr>
+          <w:rFonts w:ascii="Calibri" w:cs="Calibri" w:eastAsia="Calibri" w:hAnsi="Calibri"/>
+          <w:sz w:val="22"/>
+          <w:szCs w:val="22"/>
+        </w:rPr>
+        <w:t xml:space="preserve">Some tabs are wide: SCAN and SITES open at 640 px or wider, DHCP at 820 or wider, so a host fits on one line. A window you dragged wider stays wider. ETHER, PING and RECON return to the width you keep for them. The minimum width is 430 — visible beats small.</w:t>
       </w:r>
     </w:p>
     <w:p>
@@ -827,7 +827,329 @@
           <w:sz w:val="22"/>
           <w:szCs w:val="22"/>
         </w:rPr>
-        <w:t xml:space="preserve">Everything on this tab acts on the adapter chosen in the ADAPTER dropdown. Wireless, VPN and virtual adapters are filtered out; only wired Ethernet is listed, each with its connection state and a DHCP or STATIC badge.</w:t>
+        <w:t xml:space="preserve">Everything on this tab acts on the adapter chosen in the ADAPTER dropdown. Wireless, VPN and virtual adapters are filtered out; only wired Ethernet is listed. A connected adapter shows its negotiated link speed where it used to say CONNECTED — green for gigabit, amber for 100 Mb, red for 10 — because a gigabit port talking at 100 is a bad crimp, cable or switch port, and that is the first thing to know. Beside it, a DHCP or STATIC badge from the registry, shown whether or not the cable is in.</w:t>
+      </w:r>
+    </w:p>
+    <w:tbl>
+      <w:tblPr>
+        <w:tblW w:type="dxa" w:w="10080"/>
+        <w:tblBorders>
+          <w:top w:val="single" w:color="auto" w:sz="4"/>
+          <w:left w:val="single" w:color="auto" w:sz="4"/>
+          <w:bottom w:val="single" w:color="auto" w:sz="4"/>
+          <w:right w:val="single" w:color="auto" w:sz="4"/>
+          <w:insideH w:val="single" w:color="auto" w:sz="4"/>
+          <w:insideV w:val="single" w:color="auto" w:sz="4"/>
+        </w:tblBorders>
+      </w:tblPr>
+      <w:tblGrid>
+        <w:gridCol w:w="3000"/>
+        <w:gridCol w:w="7080"/>
+      </w:tblGrid>
+      <w:tr>
+        <w:trPr>
+          <w:tblHeader/>
+        </w:trPr>
+        <w:tc>
+          <w:tcPr>
+            <w:tcW w:type="dxa" w:w="3000"/>
+            <w:shd w:fill="E6F2EC" w:color="auto" w:val="clear"/>
+            <w:tcMar>
+              <w:top w:type="dxa" w:w="60"/>
+              <w:left w:type="dxa" w:w="100"/>
+              <w:bottom w:type="dxa" w:w="60"/>
+              <w:right w:type="dxa" w:w="100"/>
+            </w:tcMar>
+          </w:tcPr>
+          <w:p>
+            <w:pPr>
+              <w:spacing w:after="0" w:line="260"/>
+            </w:pPr>
+            <w:r>
+              <w:rPr>
+                <w:rFonts w:ascii="Calibri" w:cs="Calibri" w:eastAsia="Calibri" w:hAnsi="Calibri"/>
+                <w:b/>
+                <w:bCs/>
+                <w:sz w:val="20"/>
+                <w:szCs w:val="20"/>
+              </w:rPr>
+              <w:t xml:space="preserve">State</w:t>
+            </w:r>
+          </w:p>
+        </w:tc>
+        <w:tc>
+          <w:tcPr>
+            <w:tcW w:type="dxa" w:w="7080"/>
+            <w:shd w:fill="E6F2EC" w:color="auto" w:val="clear"/>
+            <w:tcMar>
+              <w:top w:type="dxa" w:w="60"/>
+              <w:left w:type="dxa" w:w="100"/>
+              <w:bottom w:type="dxa" w:w="60"/>
+              <w:right w:type="dxa" w:w="100"/>
+            </w:tcMar>
+          </w:tcPr>
+          <w:p>
+            <w:pPr>
+              <w:spacing w:after="0" w:line="260"/>
+            </w:pPr>
+            <w:r>
+              <w:rPr>
+                <w:rFonts w:ascii="Calibri" w:cs="Calibri" w:eastAsia="Calibri" w:hAnsi="Calibri"/>
+                <w:b/>
+                <w:bCs/>
+                <w:sz w:val="20"/>
+                <w:szCs w:val="20"/>
+              </w:rPr>
+              <w:t xml:space="preserve">Meaning</w:t>
+            </w:r>
+          </w:p>
+        </w:tc>
+      </w:tr>
+      <w:tr>
+        <w:trPr>
+          <w:tblHeader w:val="off"/>
+        </w:trPr>
+        <w:tc>
+          <w:tcPr>
+            <w:tcW w:type="dxa" w:w="3000"/>
+            <w:tcMar>
+              <w:top w:type="dxa" w:w="60"/>
+              <w:left w:type="dxa" w:w="100"/>
+              <w:bottom w:type="dxa" w:w="60"/>
+              <w:right w:type="dxa" w:w="100"/>
+            </w:tcMar>
+          </w:tcPr>
+          <w:p>
+            <w:pPr>
+              <w:spacing w:after="0" w:line="260"/>
+            </w:pPr>
+            <w:r>
+              <w:rPr>
+                <w:rFonts w:ascii="Calibri" w:cs="Calibri" w:eastAsia="Calibri" w:hAnsi="Calibri"/>
+                <w:b w:val="false"/>
+                <w:bCs w:val="false"/>
+                <w:sz w:val="20"/>
+                <w:szCs w:val="20"/>
+              </w:rPr>
+              <w:t xml:space="preserve">1 GBPS / 100 MBPS / 10 MBPS</w:t>
+            </w:r>
+          </w:p>
+        </w:tc>
+        <w:tc>
+          <w:tcPr>
+            <w:tcW w:type="dxa" w:w="7080"/>
+            <w:tcMar>
+              <w:top w:type="dxa" w:w="60"/>
+              <w:left w:type="dxa" w:w="100"/>
+              <w:bottom w:type="dxa" w:w="60"/>
+              <w:right w:type="dxa" w:w="100"/>
+            </w:tcMar>
+          </w:tcPr>
+          <w:p>
+            <w:pPr>
+              <w:spacing w:after="0" w:line="260"/>
+            </w:pPr>
+            <w:r>
+              <w:rPr>
+                <w:rFonts w:ascii="Calibri" w:cs="Calibri" w:eastAsia="Calibri" w:hAnsi="Calibri"/>
+                <w:b w:val="false"/>
+                <w:bCs w:val="false"/>
+                <w:sz w:val="20"/>
+                <w:szCs w:val="20"/>
+              </w:rPr>
+              <w:t xml:space="preserve">Link up with an address. The speed is what the switch and the NIC agreed on.</w:t>
+            </w:r>
+          </w:p>
+        </w:tc>
+      </w:tr>
+      <w:tr>
+        <w:trPr>
+          <w:tblHeader w:val="off"/>
+        </w:trPr>
+        <w:tc>
+          <w:tcPr>
+            <w:tcW w:type="dxa" w:w="3000"/>
+            <w:tcMar>
+              <w:top w:type="dxa" w:w="60"/>
+              <w:left w:type="dxa" w:w="100"/>
+              <w:bottom w:type="dxa" w:w="60"/>
+              <w:right w:type="dxa" w:w="100"/>
+            </w:tcMar>
+          </w:tcPr>
+          <w:p>
+            <w:pPr>
+              <w:spacing w:after="0" w:line="260"/>
+            </w:pPr>
+            <w:r>
+              <w:rPr>
+                <w:rFonts w:ascii="Calibri" w:cs="Calibri" w:eastAsia="Calibri" w:hAnsi="Calibri"/>
+                <w:b w:val="false"/>
+                <w:bCs w:val="false"/>
+                <w:sz w:val="20"/>
+                <w:szCs w:val="20"/>
+              </w:rPr>
+              <w:t xml:space="preserve">NO ADDRESS</w:t>
+            </w:r>
+          </w:p>
+        </w:tc>
+        <w:tc>
+          <w:tcPr>
+            <w:tcW w:type="dxa" w:w="7080"/>
+            <w:tcMar>
+              <w:top w:type="dxa" w:w="60"/>
+              <w:left w:type="dxa" w:w="100"/>
+              <w:bottom w:type="dxa" w:w="60"/>
+              <w:right w:type="dxa" w:w="100"/>
+            </w:tcMar>
+          </w:tcPr>
+          <w:p>
+            <w:pPr>
+              <w:spacing w:after="0" w:line="260"/>
+            </w:pPr>
+            <w:r>
+              <w:rPr>
+                <w:rFonts w:ascii="Calibri" w:cs="Calibri" w:eastAsia="Calibri" w:hAnsi="Calibri"/>
+                <w:b w:val="false"/>
+                <w:bCs w:val="false"/>
+                <w:sz w:val="20"/>
+                <w:szCs w:val="20"/>
+              </w:rPr>
+              <w:t xml:space="preserve">Link up, but Windows has no IPv4 address on it. On a DHCP adapter a RENEW button appears beside the badge; on a static one, APPLY.</w:t>
+            </w:r>
+          </w:p>
+        </w:tc>
+      </w:tr>
+      <w:tr>
+        <w:trPr>
+          <w:tblHeader w:val="off"/>
+        </w:trPr>
+        <w:tc>
+          <w:tcPr>
+            <w:tcW w:type="dxa" w:w="3000"/>
+            <w:tcMar>
+              <w:top w:type="dxa" w:w="60"/>
+              <w:left w:type="dxa" w:w="100"/>
+              <w:bottom w:type="dxa" w:w="60"/>
+              <w:right w:type="dxa" w:w="100"/>
+            </w:tcMar>
+          </w:tcPr>
+          <w:p>
+            <w:pPr>
+              <w:spacing w:after="0" w:line="260"/>
+            </w:pPr>
+            <w:r>
+              <w:rPr>
+                <w:rFonts w:ascii="Calibri" w:cs="Calibri" w:eastAsia="Calibri" w:hAnsi="Calibri"/>
+                <w:b w:val="false"/>
+                <w:bCs w:val="false"/>
+                <w:sz w:val="20"/>
+                <w:szCs w:val="20"/>
+              </w:rPr>
+              <w:t xml:space="preserve">DISCONNECTED</w:t>
+            </w:r>
+          </w:p>
+        </w:tc>
+        <w:tc>
+          <w:tcPr>
+            <w:tcW w:type="dxa" w:w="7080"/>
+            <w:tcMar>
+              <w:top w:type="dxa" w:w="60"/>
+              <w:left w:type="dxa" w:w="100"/>
+              <w:bottom w:type="dxa" w:w="60"/>
+              <w:right w:type="dxa" w:w="100"/>
+            </w:tcMar>
+          </w:tcPr>
+          <w:p>
+            <w:pPr>
+              <w:spacing w:after="0" w:line="260"/>
+            </w:pPr>
+            <w:r>
+              <w:rPr>
+                <w:rFonts w:ascii="Calibri" w:cs="Calibri" w:eastAsia="Calibri" w:hAnsi="Calibri"/>
+                <w:b w:val="false"/>
+                <w:bCs w:val="false"/>
+                <w:sz w:val="20"/>
+                <w:szCs w:val="20"/>
+              </w:rPr>
+              <w:t xml:space="preserve">No link. Cable, port or far end.</w:t>
+            </w:r>
+          </w:p>
+        </w:tc>
+      </w:tr>
+      <w:tr>
+        <w:trPr>
+          <w:tblHeader w:val="off"/>
+        </w:trPr>
+        <w:tc>
+          <w:tcPr>
+            <w:tcW w:type="dxa" w:w="3000"/>
+            <w:tcMar>
+              <w:top w:type="dxa" w:w="60"/>
+              <w:left w:type="dxa" w:w="100"/>
+              <w:bottom w:type="dxa" w:w="60"/>
+              <w:right w:type="dxa" w:w="100"/>
+            </w:tcMar>
+          </w:tcPr>
+          <w:p>
+            <w:pPr>
+              <w:spacing w:after="0" w:line="260"/>
+            </w:pPr>
+            <w:r>
+              <w:rPr>
+                <w:rFonts w:ascii="Calibri" w:cs="Calibri" w:eastAsia="Calibri" w:hAnsi="Calibri"/>
+                <w:b w:val="false"/>
+                <w:bCs w:val="false"/>
+                <w:sz w:val="20"/>
+                <w:szCs w:val="20"/>
+              </w:rPr>
+              <w:t xml:space="preserve">DISABLED</w:t>
+            </w:r>
+          </w:p>
+        </w:tc>
+        <w:tc>
+          <w:tcPr>
+            <w:tcW w:type="dxa" w:w="7080"/>
+            <w:tcMar>
+              <w:top w:type="dxa" w:w="60"/>
+              <w:left w:type="dxa" w:w="100"/>
+              <w:bottom w:type="dxa" w:w="60"/>
+              <w:right w:type="dxa" w:w="100"/>
+            </w:tcMar>
+          </w:tcPr>
+          <w:p>
+            <w:pPr>
+              <w:spacing w:after="0" w:line="260"/>
+            </w:pPr>
+            <w:r>
+              <w:rPr>
+                <w:rFonts w:ascii="Calibri" w:cs="Calibri" w:eastAsia="Calibri" w:hAnsi="Calibri"/>
+                <w:b w:val="false"/>
+                <w:bCs w:val="false"/>
+                <w:sz w:val="20"/>
+                <w:szCs w:val="20"/>
+              </w:rPr>
+              <w:t xml:space="preserve">Switched off in Windows. ENABLE in the ADAPTER line brings it back.</w:t>
+            </w:r>
+          </w:p>
+        </w:tc>
+      </w:tr>
+    </w:tbl>
+    <w:p>
+      <w:pPr>
+        <w:spacing w:after="120"/>
+      </w:pPr>
+    </w:p>
+    <w:p>
+      <w:pPr>
+        <w:spacing w:after="120" w:line="276"/>
+      </w:pPr>
+      <w:r>
+        <w:rPr>
+          <w:rFonts w:ascii="Calibri" w:cs="Calibri" w:eastAsia="Calibri" w:hAnsi="Calibri"/>
+          <w:sz w:val="22"/>
+          <w:szCs w:val="22"/>
+        </w:rPr>
+        <w:t xml:space="preserve">The ADAPTER line carries two chips. WI-FI switches every wireless adapter off (or back on) so SCAN, DHCP and PING go out the wire and nothing else; it stays amber — WI-FI OFF — until you switch it back, and it stays off through a reboot, so don't leave the site without it. DISABLE / ENABLE does the same for the selected wired adapter: the link drops, the configuration is kept, ENABLE brings it back.</w:t>
       </w:r>
     </w:p>
     <w:p>
@@ -845,7 +1167,7 @@
           <w:sz w:val="22"/>
           <w:szCs w:val="22"/>
         </w:rPr>
-        <w:t xml:space="preserve">Docks present their own network adapter. If you see two ("Ethernet" and "Ethernet 2"), pick the one that says CONNECTED.</w:t>
+        <w:t xml:space="preserve">Docks present their own network adapter. If you see two ("Ethernet" and "Ethernet 2"), pick the one with a link speed.</w:t>
       </w:r>
     </w:p>
     <w:p>
@@ -1053,7 +1375,7 @@
       </w:tr>
       <w:tr>
         <w:trPr>
-          <w:tblHeader w:val="false"/>
+          <w:tblHeader w:val="off"/>
         </w:trPr>
         <w:tc>
           <w:tcPr>
@@ -1110,7 +1432,7 @@
       </w:tr>
       <w:tr>
         <w:trPr>
-          <w:tblHeader w:val="false"/>
+          <w:tblHeader w:val="off"/>
         </w:trPr>
         <w:tc>
           <w:tcPr>
@@ -1160,14 +1482,14 @@
                 <w:sz w:val="20"/>
                 <w:szCs w:val="20"/>
               </w:rPr>
-              <w:t xml:space="preserve">Beside the STATIC badge in the adapter row. Click twice to hand the adapter back to DHCP.</w:t>
+              <w:t xml:space="preserve">Beside the STATIC badge in the adapter row. Click twice to hand the adapter back to DHCP. Switching to DHCP drops every Multi-IP on that adapter.</w:t>
             </w:r>
           </w:p>
         </w:tc>
       </w:tr>
       <w:tr>
         <w:trPr>
-          <w:tblHeader w:val="false"/>
+          <w:tblHeader w:val="off"/>
         </w:trPr>
         <w:tc>
           <w:tcPr>
@@ -1191,7 +1513,7 @@
                 <w:sz w:val="20"/>
                 <w:szCs w:val="20"/>
               </w:rPr>
-              <w:t xml:space="preserve">REVERT</w:t>
+              <w:t xml:space="preserve">RENEW</w:t>
             </w:r>
           </w:p>
         </w:tc>
@@ -1217,14 +1539,14 @@
                 <w:sz w:val="20"/>
                 <w:szCs w:val="20"/>
               </w:rPr>
-              <w:t xml:space="preserve">Restores the configuration from before your last APPLY.</w:t>
+              <w:t xml:space="preserve">Beside the DHCP badge when the adapter has link but no address. Asks the DHCP server again.</w:t>
             </w:r>
           </w:p>
         </w:tc>
       </w:tr>
       <w:tr>
         <w:trPr>
-          <w:tblHeader w:val="false"/>
+          <w:tblHeader w:val="off"/>
         </w:trPr>
         <w:tc>
           <w:tcPr>
@@ -1248,7 +1570,7 @@
                 <w:sz w:val="20"/>
                 <w:szCs w:val="20"/>
               </w:rPr>
-              <w:t xml:space="preserve">COPY COMMANDS</w:t>
+              <w:t xml:space="preserve">REVERT</w:t>
             </w:r>
           </w:p>
         </w:tc>
@@ -1274,14 +1596,71 @@
                 <w:sz w:val="20"/>
                 <w:szCs w:val="20"/>
               </w:rPr>
-              <w:t xml:space="preserve">Shows the exact netsh commands without running them, with a COPY button for an admin prompt.</w:t>
+              <w:t xml:space="preserve">Restores the configuration from before your last APPLY — straight back to DHCP if that is where you came from.</w:t>
             </w:r>
           </w:p>
         </w:tc>
       </w:tr>
       <w:tr>
         <w:trPr>
-          <w:tblHeader w:val="false"/>
+          <w:tblHeader w:val="off"/>
+        </w:trPr>
+        <w:tc>
+          <w:tcPr>
+            <w:tcW w:type="dxa" w:w="2600"/>
+            <w:tcMar>
+              <w:top w:type="dxa" w:w="60"/>
+              <w:left w:type="dxa" w:w="100"/>
+              <w:bottom w:type="dxa" w:w="60"/>
+              <w:right w:type="dxa" w:w="100"/>
+            </w:tcMar>
+          </w:tcPr>
+          <w:p>
+            <w:pPr>
+              <w:spacing w:after="0" w:line="260"/>
+            </w:pPr>
+            <w:r>
+              <w:rPr>
+                <w:rFonts w:ascii="Calibri" w:cs="Calibri" w:eastAsia="Calibri" w:hAnsi="Calibri"/>
+                <w:b w:val="false"/>
+                <w:bCs w:val="false"/>
+                <w:sz w:val="20"/>
+                <w:szCs w:val="20"/>
+              </w:rPr>
+              <w:t xml:space="preserve">COPY COMMANDS</w:t>
+            </w:r>
+          </w:p>
+        </w:tc>
+        <w:tc>
+          <w:tcPr>
+            <w:tcW w:type="dxa" w:w="7480"/>
+            <w:tcMar>
+              <w:top w:type="dxa" w:w="60"/>
+              <w:left w:type="dxa" w:w="100"/>
+              <w:bottom w:type="dxa" w:w="60"/>
+              <w:right w:type="dxa" w:w="100"/>
+            </w:tcMar>
+          </w:tcPr>
+          <w:p>
+            <w:pPr>
+              <w:spacing w:after="0" w:line="260"/>
+            </w:pPr>
+            <w:r>
+              <w:rPr>
+                <w:rFonts w:ascii="Calibri" w:cs="Calibri" w:eastAsia="Calibri" w:hAnsi="Calibri"/>
+                <w:b w:val="false"/>
+                <w:bCs w:val="false"/>
+                <w:sz w:val="20"/>
+                <w:szCs w:val="20"/>
+              </w:rPr>
+              <w:t xml:space="preserve">Shows the exact netsh commands without running them, with a COPY button for an admin prompt.</w:t>
+            </w:r>
+          </w:p>
+        </w:tc>
+      </w:tr>
+      <w:tr>
+        <w:trPr>
+          <w:tblHeader w:val="off"/>
         </w:trPr>
         <w:tc>
           <w:tcPr>
@@ -1400,7 +1779,7 @@
           <w:sz w:val="22"/>
           <w:szCs w:val="22"/>
         </w:rPr>
-        <w:t xml:space="preserve">Enter the IP and mask, press ADD MULTI-IP. The app confirms the address is really present before reporting success.</w:t>
+        <w:t xml:space="preserve">Enter the IP and mask, press ADD MULTI-IP. The mask defaults to 255.255.255.0 (255.255.0.0 for 169.254 addresses). The app confirms the address is really present before reporting success. The list marks your real address PRIMARY and only offers REMOVE on the others; it re-reads itself after every change, so what it shows is what Windows has.</w:t>
       </w:r>
     </w:p>
     <w:p>
@@ -1649,7 +2028,7 @@
           <w:sz w:val="22"/>
           <w:szCs w:val="22"/>
         </w:rPr>
-        <w:t xml:space="preserve">Serving stops on its own after 30 minutes with nothing to do (ADVANCED OPTIONS changes or disables this). The mode badge — OFFLINE / LISTENING / SERVING — is also the on-off switch; OFFLINE releases the port and removes the firewall rule.</w:t>
+        <w:t xml:space="preserve">Serving stops on its own after 30 minutes with nothing to do (ADVANCED OPTIONS changes or disables this). The mode badge — OFFLINE / LISTENING / SERVING — is also the on-off switch; OFFLINE releases the port and removes the firewall rule. The same red / green / amber dot sits on the DHCP tab itself, so the engine's state is visible from every tab. While RECON's SILENT listen has the adapter the engine shows SUSPENDED and resumes by itself.</w:t>
       </w:r>
     </w:p>
     <w:p>
@@ -1746,7 +2125,7 @@
       </w:tr>
       <w:tr>
         <w:trPr>
-          <w:tblHeader w:val="false"/>
+          <w:tblHeader w:val="off"/>
         </w:trPr>
         <w:tc>
           <w:tcPr>
@@ -1796,14 +2175,14 @@
                 <w:sz w:val="20"/>
                 <w:szCs w:val="20"/>
               </w:rPr>
-              <w:t xml:space="preserve">Which adapter to serve on. Follows the ETHER tab's adapter unless you pick another. LINK UP / NO LINK beside it is live.</w:t>
+              <w:t xml:space="preserve">Which adapter to serve on. Follows the ETHER tab's adapter unless you pick another. LINK UP / NO LINK beside it is live. An adapter that also carries a Multi-IP asks which address to serve from — pick the alias to hand out leases on the camera subnet while the laptop keeps its own; ⟳ asks again.</w:t>
             </w:r>
           </w:p>
         </w:tc>
       </w:tr>
       <w:tr>
         <w:trPr>
-          <w:tblHeader w:val="false"/>
+          <w:tblHeader w:val="off"/>
         </w:trPr>
         <w:tc>
           <w:tcPr>
@@ -1860,7 +2239,7 @@
       </w:tr>
       <w:tr>
         <w:trPr>
-          <w:tblHeader w:val="false"/>
+          <w:tblHeader w:val="off"/>
         </w:trPr>
         <w:tc>
           <w:tcPr>
@@ -1917,7 +2296,7 @@
       </w:tr>
       <w:tr>
         <w:trPr>
-          <w:tblHeader w:val="false"/>
+          <w:tblHeader w:val="off"/>
         </w:trPr>
         <w:tc>
           <w:tcPr>
@@ -1974,7 +2353,7 @@
       </w:tr>
       <w:tr>
         <w:trPr>
-          <w:tblHeader w:val="false"/>
+          <w:tblHeader w:val="off"/>
         </w:trPr>
         <w:tc>
           <w:tcPr>
@@ -2031,7 +2410,7 @@
       </w:tr>
       <w:tr>
         <w:trPr>
-          <w:tblHeader w:val="false"/>
+          <w:tblHeader w:val="off"/>
         </w:trPr>
         <w:tc>
           <w:tcPr>
@@ -2088,7 +2467,7 @@
       </w:tr>
       <w:tr>
         <w:trPr>
-          <w:tblHeader w:val="false"/>
+          <w:tblHeader w:val="off"/>
         </w:trPr>
         <w:tc>
           <w:tcPr>
@@ -2138,14 +2517,14 @@
                 <w:sz w:val="20"/>
                 <w:szCs w:val="20"/>
               </w:rPr>
-              <w:t xml:space="preserve">Status, address, MAC, vendor, hostname, activity. SERVE, OPEN (web UI), ★ pin, ✕ take the address back. Randomised MACs (phones with privacy on) are labelled as such.</w:t>
+              <w:t xml:space="preserve">Status, address, MAC, vendor, hostname, activity. SERVE, OPEN (web UI), ★ pin, ✕ take the address back. Randomised MACs (phones with privacy on) are labelled as such. Tick several rows and ★ RESERVE SELECTED gives them consecutive fixed addresses from a start you type — twenty cameras in one go; the server, gateway and existing reservations are skipped.</w:t>
             </w:r>
           </w:p>
         </w:tc>
       </w:tr>
       <w:tr>
         <w:trPr>
-          <w:tblHeader w:val="false"/>
+          <w:tblHeader w:val="off"/>
         </w:trPr>
         <w:tc>
           <w:tcPr>
@@ -2290,7 +2669,7 @@
           <w:sz w:val="22"/>
           <w:szCs w:val="22"/>
         </w:rPr>
-        <w:t xml:space="preserve">Checks use a TCP connection to port 80, not ICMP, so they work through switches and appliances that drop ping.</w:t>
+        <w:t xml:space="preserve">A plain target is pinged; if ping is blocked, a TCP connection to port 80 counts as alive, so it works through switches and appliances that drop ICMP. Add :port to a target (192.168.0.50:554) to watch one service instead: CLOSED means the host answered but that port is shut, FAIL means the host is gone. The status line counts the two separately.</w:t>
       </w:r>
     </w:p>
     <w:p>
@@ -2351,10 +2730,56 @@
       <w:r>
         <w:rPr>
           <w:rFonts w:ascii="Calibri" w:cs="Calibri" w:eastAsia="Calibri" w:hAnsi="Calibri"/>
-          <w:sz w:val="22"/>
-          <w:szCs w:val="22"/>
-        </w:rPr>
-        <w:t xml:space="preserve">TRCRT runs a live traceroute to that host. COPY puts the whole summary on the clipboard for the service report.</w:t>
+          <w:b/>
+          <w:bCs/>
+          <w:sz w:val="22"/>
+          <w:szCs w:val="22"/>
+        </w:rPr>
+        <w:t xml:space="preserve">⚡ BLINK</w:t>
+      </w:r>
+      <w:r>
+        <w:rPr>
+          <w:rFonts w:ascii="Calibri" w:cs="Calibri" w:eastAsia="Calibri" w:hAnsi="Calibri"/>
+          <w:sz w:val="22"/>
+          <w:szCs w:val="22"/>
+        </w:rPr>
+        <w:t xml:space="preserve"> — with a host toned, 20 seconds of tiny packets to it so that port's activity LED strobes on the switch. Find the port without pulling anything. Same subnet only.</w:t>
+      </w:r>
+    </w:p>
+    <w:p>
+      <w:pPr>
+        <w:pStyle w:val="ListParagraph"/>
+        <w:numPr>
+          <w:ilvl w:val="0"/>
+          <w:numId w:val="2"/>
+        </w:numPr>
+        <w:spacing w:after="80" w:line="276"/>
+      </w:pPr>
+      <w:r>
+        <w:rPr>
+          <w:rFonts w:ascii="Calibri" w:cs="Calibri" w:eastAsia="Calibri" w:hAnsi="Calibri"/>
+          <w:sz w:val="22"/>
+          <w:szCs w:val="22"/>
+        </w:rPr>
+        <w:t xml:space="preserve">The sonar pitch drops as latency climbs, so a struggling link is audible before it fails. If the HUD is in the tray when the toned host flips state, a Windows toast tells you; clicking it brings the HUD back.</w:t>
+      </w:r>
+    </w:p>
+    <w:p>
+      <w:pPr>
+        <w:pStyle w:val="ListParagraph"/>
+        <w:numPr>
+          <w:ilvl w:val="0"/>
+          <w:numId w:val="2"/>
+        </w:numPr>
+        <w:spacing w:after="80" w:line="276"/>
+      </w:pPr>
+      <w:r>
+        <w:rPr>
+          <w:rFonts w:ascii="Calibri" w:cs="Calibri" w:eastAsia="Calibri" w:hAnsi="Calibri"/>
+          <w:sz w:val="22"/>
+          <w:szCs w:val="22"/>
+        </w:rPr>
+        <w:t xml:space="preserve">TRCRT runs a live traceroute to that host. ◉ opens a Wireshark capture filtered to that host (when Wireshark is installed). COPY puts the whole summary on the clipboard for the service report.</w:t>
       </w:r>
     </w:p>
     <w:p>
@@ -2402,7 +2827,7 @@
           <w:sz w:val="22"/>
           <w:szCs w:val="22"/>
         </w:rPr>
-        <w:t xml:space="preserve">Sweeps a /24 with ICMP and ARP, probes ten common service ports on every responder, then resolves names. Rows are kept in address order as they arrive.</w:t>
+        <w:t xml:space="preserve">Two buttons, two ways to find things. SCAN SUBNET sweeps a /24 with ICMP and ARP, probes fourteen service ports on every responder (web, RTSP, RDP, SSH and the Hikvision, Dahua, Bosch and Genetec ports), then resolves names. DISCOVER asks the wire instead: one WS-Discovery/ONVIF probe, one SSDP, one mDNS, three seconds. Discovery runs alongside every sweep and on its own, and it finds what a sweep cannot — a camera on a different subnet, a factory-default box on 169.254.x.x — because the probe is multicast and the reply comes back over the same cable regardless of IP.</w:t>
       </w:r>
     </w:p>
     <w:p>
@@ -2456,7 +2881,35 @@
           <w:sz w:val="22"/>
           <w:szCs w:val="22"/>
         </w:rPr>
-        <w:t xml:space="preserve">Each row shows IP, response time, MAC, hostname, vendor, and open ports. Your own laptop is marked SELF. IP, MAC and PING buttons copy or hand the device to the monitor.</w:t>
+        <w:t xml:space="preserve">Each row shows IP, MAC, response time, hostname, vendor, open ports and — when the device answered discovery — a badge (ONVIF, SSDP, mDNS) with its name, model and URLs in the tooltip. Your own laptop is marked SELF. IP, MAC, PING and WSHARK copy, hand the device to the monitor, or open a Wireshark capture filtered to it. A row found by discovery alone shows the source where the response time would be.</w:t>
+      </w:r>
+    </w:p>
+    <w:p>
+      <w:pPr>
+        <w:pStyle w:val="ListParagraph"/>
+        <w:numPr>
+          <w:ilvl w:val="0"/>
+          <w:numId w:val="2"/>
+        </w:numPr>
+        <w:spacing w:after="80" w:line="276"/>
+      </w:pPr>
+      <w:r>
+        <w:rPr>
+          <w:rFonts w:ascii="Calibri" w:cs="Calibri" w:eastAsia="Calibri" w:hAnsi="Calibri"/>
+          <w:b/>
+          <w:bCs/>
+          <w:sz w:val="22"/>
+          <w:szCs w:val="22"/>
+        </w:rPr>
+        <w:t xml:space="preserve">REACH</w:t>
+      </w:r>
+      <w:r>
+        <w:rPr>
+          <w:rFonts w:ascii="Calibri" w:cs="Calibri" w:eastAsia="Calibri" w:hAnsi="Calibri"/>
+          <w:sz w:val="22"/>
+          <w:szCs w:val="22"/>
+        </w:rPr>
+        <w:t xml:space="preserve"> appears on 169.254 rows. It adds a temporary link-local address to your adapter (converting a DHCP adapter to static first, with a warning), opens the device's web page, and shows an amber LINK-LOCAL chip with REMOVE. The alias is removed when you quit, and cleaned up on the next launch if the app was force-closed.</w:t>
       </w:r>
     </w:p>
     <w:p>
@@ -2528,7 +2981,7 @@
           <w:sz w:val="22"/>
           <w:szCs w:val="22"/>
         </w:rPr>
-        <w:t xml:space="preserve">SAVE SITE stores the results for next time.</w:t>
+        <w:t xml:space="preserve">COPY ▾ puts the whole list on the clipboard as CSV (for Excel) or a markdown table (for the ticket). SAVE SITE stores the results for next time.</w:t>
       </w:r>
     </w:p>
     <w:p>
@@ -2630,7 +3083,43 @@
           <w:sz w:val="22"/>
           <w:szCs w:val="22"/>
         </w:rPr>
-        <w:t xml:space="preserve">Type chip: click to cycle CAMERA · NVR/DVR · NETWORK · SERVER · WORKSTATION · ACCESS CTL · PRINTER · OTHER. Types are guessed from the vendor and can be corrected.</w:t>
+        <w:t xml:space="preserve">Type chip: click to cycle CAMERA · NVR/DVR · NETWORK · SERVER · WORKSTATION · ACCESS CTL · PRINTER · MEDIA · OTHER. Types are guessed from what the device announces (ONVIF, printer or media services) first and its MAC vendor second; a type you set by hand is kept.</w:t>
+      </w:r>
+    </w:p>
+    <w:p>
+      <w:pPr>
+        <w:pStyle w:val="ListParagraph"/>
+        <w:numPr>
+          <w:ilvl w:val="0"/>
+          <w:numId w:val="2"/>
+        </w:numPr>
+        <w:spacing w:after="80" w:line="276"/>
+      </w:pPr>
+      <w:r>
+        <w:rPr>
+          <w:rFonts w:ascii="Calibri" w:cs="Calibri" w:eastAsia="Calibri" w:hAnsi="Calibri"/>
+          <w:sz w:val="22"/>
+          <w:szCs w:val="22"/>
+        </w:rPr>
+        <w:t xml:space="preserve">WAKE in the device drawer sends a Wake-on-LAN magic packet to that MAC on every connected subnet. Give it thirty seconds, then scan.</w:t>
+      </w:r>
+    </w:p>
+    <w:p>
+      <w:pPr>
+        <w:pStyle w:val="ListParagraph"/>
+        <w:numPr>
+          <w:ilvl w:val="0"/>
+          <w:numId w:val="2"/>
+        </w:numPr>
+        <w:spacing w:after="80" w:line="276"/>
+      </w:pPr>
+      <w:r>
+        <w:rPr>
+          <w:rFonts w:ascii="Calibri" w:cs="Calibri" w:eastAsia="Calibri" w:hAnsi="Calibri"/>
+          <w:sz w:val="22"/>
+          <w:szCs w:val="22"/>
+        </w:rPr>
+        <w:t xml:space="preserve">DELETE on a site writes a backup of the whole database first.</w:t>
       </w:r>
     </w:p>
     <w:p>
@@ -2788,7 +3277,7 @@
       </w:tr>
       <w:tr>
         <w:trPr>
-          <w:tblHeader w:val="false"/>
+          <w:tblHeader w:val="off"/>
         </w:trPr>
         <w:tc>
           <w:tcPr>
@@ -2845,7 +3334,7 @@
       </w:tr>
       <w:tr>
         <w:trPr>
-          <w:tblHeader w:val="false"/>
+          <w:tblHeader w:val="off"/>
         </w:trPr>
         <w:tc>
           <w:tcPr>
@@ -2902,7 +3391,7 @@
       </w:tr>
       <w:tr>
         <w:trPr>
-          <w:tblHeader w:val="false"/>
+          <w:tblHeader w:val="off"/>
         </w:trPr>
         <w:tc>
           <w:tcPr>
@@ -2977,7 +3466,7 @@
           <w:sz w:val="32"/>
           <w:szCs w:val="32"/>
         </w:rPr>
-        <w:t xml:space="preserve">8. DIAGNOSTICS</w:t>
+        <w:t xml:space="preserve">8. RECON — listen before you talk</w:t>
       </w:r>
     </w:p>
     <w:p>
@@ -2990,79 +3479,541 @@
           <w:sz w:val="22"/>
           <w:szCs w:val="22"/>
         </w:rPr>
-        <w:t xml:space="preserve">Version chip → DIAGNOSTICS.</w:t>
-      </w:r>
-    </w:p>
-    <w:p>
-      <w:pPr>
-        <w:pStyle w:val="ListParagraph"/>
-        <w:numPr>
-          <w:ilvl w:val="0"/>
-          <w:numId w:val="2"/>
-        </w:numPr>
-        <w:spacing w:after="80" w:line="276"/>
-      </w:pPr>
-      <w:r>
-        <w:rPr>
-          <w:rFonts w:ascii="Calibri" w:cs="Calibri" w:eastAsia="Calibri" w:hAnsi="Calibri"/>
-          <w:sz w:val="22"/>
-          <w:szCs w:val="22"/>
-        </w:rPr>
-        <w:t xml:space="preserve">TOOLS — MTU → 1500 for the adapter selected in ETHER.</w:t>
-      </w:r>
-    </w:p>
-    <w:p>
-      <w:pPr>
-        <w:pStyle w:val="ListParagraph"/>
-        <w:numPr>
-          <w:ilvl w:val="0"/>
-          <w:numId w:val="2"/>
-        </w:numPr>
-        <w:spacing w:after="80" w:line="276"/>
-      </w:pPr>
-      <w:r>
-        <w:rPr>
-          <w:rFonts w:ascii="Calibri" w:cs="Calibri" w:eastAsia="Calibri" w:hAnsi="Calibri"/>
-          <w:sz w:val="22"/>
-          <w:szCs w:val="22"/>
-        </w:rPr>
-        <w:t xml:space="preserve">STATE — version, whether the app is elevated, your user and machine, where the data lives, credential storage status, the DHCP engine's state, and any policy in effect.</w:t>
-      </w:r>
-    </w:p>
-    <w:p>
-      <w:pPr>
-        <w:pStyle w:val="ListParagraph"/>
-        <w:numPr>
-          <w:ilvl w:val="0"/>
-          <w:numId w:val="2"/>
-        </w:numPr>
-        <w:spacing w:after="80" w:line="276"/>
-      </w:pPr>
-      <w:r>
-        <w:rPr>
-          <w:rFonts w:ascii="Calibri" w:cs="Calibri" w:eastAsia="Calibri" w:hAnsi="Calibri"/>
-          <w:sz w:val="22"/>
-          <w:szCs w:val="22"/>
-        </w:rPr>
-        <w:t xml:space="preserve">LOG — every adapter change the app made, with the exact commands run, their output, and whether the change was confirmed. Also launches, backups, imports, DHCP engine and firewall changes, rogue-server scans, and name-resolution timings. Survives restarts.</w:t>
-      </w:r>
-    </w:p>
-    <w:p>
-      <w:pPr>
-        <w:pStyle w:val="ListParagraph"/>
-        <w:numPr>
-          <w:ilvl w:val="0"/>
-          <w:numId w:val="2"/>
-        </w:numPr>
-        <w:spacing w:after="80" w:line="276"/>
-      </w:pPr>
-      <w:r>
-        <w:rPr>
-          <w:rFonts w:ascii="Calibri" w:cs="Calibri" w:eastAsia="Calibri" w:hAnsi="Calibri"/>
-          <w:sz w:val="22"/>
-          <w:szCs w:val="22"/>
-        </w:rPr>
-        <w:t xml:space="preserve">COPY DIAGNOSTICS — puts a plain-text report on the clipboard.</w:t>
+        <w:t xml:space="preserve">Plug into a port, say nothing, and let the port tell you what it is. RECON runs a passive capture through the Wireshark that is already on the laptop for up to 65 seconds and turns what it hears into verdicts, in the order they arrive. Nothing is transmitted.</w:t>
+      </w:r>
+    </w:p>
+    <w:tbl>
+      <w:tblPr>
+        <w:tblW w:type="dxa" w:w="10080"/>
+        <w:tblBorders>
+          <w:top w:val="single" w:color="auto" w:sz="4"/>
+          <w:left w:val="single" w:color="auto" w:sz="4"/>
+          <w:bottom w:val="single" w:color="auto" w:sz="4"/>
+          <w:right w:val="single" w:color="auto" w:sz="4"/>
+          <w:insideH w:val="single" w:color="auto" w:sz="4"/>
+          <w:insideV w:val="single" w:color="auto" w:sz="4"/>
+        </w:tblBorders>
+      </w:tblPr>
+      <w:tblGrid>
+        <w:gridCol w:w="2000"/>
+        <w:gridCol w:w="8080"/>
+      </w:tblGrid>
+      <w:tr>
+        <w:trPr>
+          <w:tblHeader/>
+        </w:trPr>
+        <w:tc>
+          <w:tcPr>
+            <w:tcW w:type="dxa" w:w="2000"/>
+            <w:shd w:fill="E6F2EC" w:color="auto" w:val="clear"/>
+            <w:tcMar>
+              <w:top w:type="dxa" w:w="60"/>
+              <w:left w:type="dxa" w:w="100"/>
+              <w:bottom w:type="dxa" w:w="60"/>
+              <w:right w:type="dxa" w:w="100"/>
+            </w:tcMar>
+          </w:tcPr>
+          <w:p>
+            <w:pPr>
+              <w:spacing w:after="0" w:line="260"/>
+            </w:pPr>
+            <w:r>
+              <w:rPr>
+                <w:rFonts w:ascii="Calibri" w:cs="Calibri" w:eastAsia="Calibri" w:hAnsi="Calibri"/>
+                <w:b/>
+                <w:bCs/>
+                <w:sz w:val="20"/>
+                <w:szCs w:val="20"/>
+              </w:rPr>
+              <w:t xml:space="preserve">Card</w:t>
+            </w:r>
+          </w:p>
+        </w:tc>
+        <w:tc>
+          <w:tcPr>
+            <w:tcW w:type="dxa" w:w="8080"/>
+            <w:shd w:fill="E6F2EC" w:color="auto" w:val="clear"/>
+            <w:tcMar>
+              <w:top w:type="dxa" w:w="60"/>
+              <w:left w:type="dxa" w:w="100"/>
+              <w:bottom w:type="dxa" w:w="60"/>
+              <w:right w:type="dxa" w:w="100"/>
+            </w:tcMar>
+          </w:tcPr>
+          <w:p>
+            <w:pPr>
+              <w:spacing w:after="0" w:line="260"/>
+            </w:pPr>
+            <w:r>
+              <w:rPr>
+                <w:rFonts w:ascii="Calibri" w:cs="Calibri" w:eastAsia="Calibri" w:hAnsi="Calibri"/>
+                <w:b/>
+                <w:bCs/>
+                <w:sz w:val="20"/>
+                <w:szCs w:val="20"/>
+              </w:rPr>
+              <w:t xml:space="preserve">What it tells you</w:t>
+            </w:r>
+          </w:p>
+        </w:tc>
+      </w:tr>
+      <w:tr>
+        <w:trPr>
+          <w:tblHeader w:val="off"/>
+        </w:trPr>
+        <w:tc>
+          <w:tcPr>
+            <w:tcW w:type="dxa" w:w="2000"/>
+            <w:tcMar>
+              <w:top w:type="dxa" w:w="60"/>
+              <w:left w:type="dxa" w:w="100"/>
+              <w:bottom w:type="dxa" w:w="60"/>
+              <w:right w:type="dxa" w:w="100"/>
+            </w:tcMar>
+          </w:tcPr>
+          <w:p>
+            <w:pPr>
+              <w:spacing w:after="0" w:line="260"/>
+            </w:pPr>
+            <w:r>
+              <w:rPr>
+                <w:rFonts w:ascii="Calibri" w:cs="Calibri" w:eastAsia="Calibri" w:hAnsi="Calibri"/>
+                <w:b w:val="false"/>
+                <w:bCs w:val="false"/>
+                <w:sz w:val="20"/>
+                <w:szCs w:val="20"/>
+              </w:rPr>
+              <w:t xml:space="preserve">SWITCH</w:t>
+            </w:r>
+          </w:p>
+        </w:tc>
+        <w:tc>
+          <w:tcPr>
+            <w:tcW w:type="dxa" w:w="8080"/>
+            <w:tcMar>
+              <w:top w:type="dxa" w:w="60"/>
+              <w:left w:type="dxa" w:w="100"/>
+              <w:bottom w:type="dxa" w:w="60"/>
+              <w:right w:type="dxa" w:w="100"/>
+            </w:tcMar>
+          </w:tcPr>
+          <w:p>
+            <w:pPr>
+              <w:spacing w:after="0" w:line="260"/>
+            </w:pPr>
+            <w:r>
+              <w:rPr>
+                <w:rFonts w:ascii="Calibri" w:cs="Calibri" w:eastAsia="Calibri" w:hAnsi="Calibri"/>
+                <w:b w:val="false"/>
+                <w:bCs w:val="false"/>
+                <w:sz w:val="20"/>
+                <w:szCs w:val="20"/>
+              </w:rPr>
+              <w:t xml:space="preserve">Switch name, port and VLAN from LLDP (every 30 s) or CDP (every 60 s). "No announcement" means LLDP/CDP is off on that port or it is not a managed switch — an answer, not an error.</w:t>
+            </w:r>
+          </w:p>
+        </w:tc>
+      </w:tr>
+      <w:tr>
+        <w:trPr>
+          <w:tblHeader w:val="off"/>
+        </w:trPr>
+        <w:tc>
+          <w:tcPr>
+            <w:tcW w:type="dxa" w:w="2000"/>
+            <w:tcMar>
+              <w:top w:type="dxa" w:w="60"/>
+              <w:left w:type="dxa" w:w="100"/>
+              <w:bottom w:type="dxa" w:w="60"/>
+              <w:right w:type="dxa" w:w="100"/>
+            </w:tcMar>
+          </w:tcPr>
+          <w:p>
+            <w:pPr>
+              <w:spacing w:after="0" w:line="260"/>
+            </w:pPr>
+            <w:r>
+              <w:rPr>
+                <w:rFonts w:ascii="Calibri" w:cs="Calibri" w:eastAsia="Calibri" w:hAnsi="Calibri"/>
+                <w:b w:val="false"/>
+                <w:bCs w:val="false"/>
+                <w:sz w:val="20"/>
+                <w:szCs w:val="20"/>
+              </w:rPr>
+              <w:t xml:space="preserve">802.1X</w:t>
+            </w:r>
+          </w:p>
+        </w:tc>
+        <w:tc>
+          <w:tcPr>
+            <w:tcW w:type="dxa" w:w="8080"/>
+            <w:tcMar>
+              <w:top w:type="dxa" w:w="60"/>
+              <w:left w:type="dxa" w:w="100"/>
+              <w:bottom w:type="dxa" w:w="60"/>
+              <w:right w:type="dxa" w:w="100"/>
+            </w:tcMar>
+          </w:tcPr>
+          <w:p>
+            <w:pPr>
+              <w:spacing w:after="0" w:line="260"/>
+            </w:pPr>
+            <w:r>
+              <w:rPr>
+                <w:rFonts w:ascii="Calibri" w:cs="Calibri" w:eastAsia="Calibri" w:hAnsi="Calibri"/>
+                <w:b w:val="false"/>
+                <w:bCs w:val="false"/>
+                <w:sz w:val="20"/>
+                <w:szCs w:val="20"/>
+              </w:rPr>
+              <w:t xml:space="preserve">Whether the switch asked for authentication. A camera without a certificate on such a port gets MAB or the guest VLAN, if anything.</w:t>
+            </w:r>
+          </w:p>
+        </w:tc>
+      </w:tr>
+      <w:tr>
+        <w:trPr>
+          <w:tblHeader w:val="off"/>
+        </w:trPr>
+        <w:tc>
+          <w:tcPr>
+            <w:tcW w:type="dxa" w:w="2000"/>
+            <w:tcMar>
+              <w:top w:type="dxa" w:w="60"/>
+              <w:left w:type="dxa" w:w="100"/>
+              <w:bottom w:type="dxa" w:w="60"/>
+              <w:right w:type="dxa" w:w="100"/>
+            </w:tcMar>
+          </w:tcPr>
+          <w:p>
+            <w:pPr>
+              <w:spacing w:after="0" w:line="260"/>
+            </w:pPr>
+            <w:r>
+              <w:rPr>
+                <w:rFonts w:ascii="Calibri" w:cs="Calibri" w:eastAsia="Calibri" w:hAnsi="Calibri"/>
+                <w:b w:val="false"/>
+                <w:bCs w:val="false"/>
+                <w:sz w:val="20"/>
+                <w:szCs w:val="20"/>
+              </w:rPr>
+              <w:t xml:space="preserve">STP / TRUNK</w:t>
+            </w:r>
+          </w:p>
+        </w:tc>
+        <w:tc>
+          <w:tcPr>
+            <w:tcW w:type="dxa" w:w="8080"/>
+            <w:tcMar>
+              <w:top w:type="dxa" w:w="60"/>
+              <w:left w:type="dxa" w:w="100"/>
+              <w:bottom w:type="dxa" w:w="60"/>
+              <w:right w:type="dxa" w:w="100"/>
+            </w:tcMar>
+          </w:tcPr>
+          <w:p>
+            <w:pPr>
+              <w:spacing w:after="0" w:line="260"/>
+            </w:pPr>
+            <w:r>
+              <w:rPr>
+                <w:rFonts w:ascii="Calibri" w:cs="Calibri" w:eastAsia="Calibri" w:hAnsi="Calibri"/>
+                <w:b w:val="false"/>
+                <w:bCs w:val="false"/>
+                <w:sz w:val="20"/>
+                <w:szCs w:val="20"/>
+              </w:rPr>
+              <w:t xml:space="preserve">Spanning-tree running (don't hang an unmanaged switch off it); tagged frames or per-VLAN BPDUs for several VLANs mean a trunk, where an untagged device lands on the native VLAN.</w:t>
+            </w:r>
+          </w:p>
+        </w:tc>
+      </w:tr>
+      <w:tr>
+        <w:trPr>
+          <w:tblHeader w:val="off"/>
+        </w:trPr>
+        <w:tc>
+          <w:tcPr>
+            <w:tcW w:type="dxa" w:w="2000"/>
+            <w:tcMar>
+              <w:top w:type="dxa" w:w="60"/>
+              <w:left w:type="dxa" w:w="100"/>
+              <w:bottom w:type="dxa" w:w="60"/>
+              <w:right w:type="dxa" w:w="100"/>
+            </w:tcMar>
+          </w:tcPr>
+          <w:p>
+            <w:pPr>
+              <w:spacing w:after="0" w:line="260"/>
+            </w:pPr>
+            <w:r>
+              <w:rPr>
+                <w:rFonts w:ascii="Calibri" w:cs="Calibri" w:eastAsia="Calibri" w:hAnsi="Calibri"/>
+                <w:b w:val="false"/>
+                <w:bCs w:val="false"/>
+                <w:sz w:val="20"/>
+                <w:szCs w:val="20"/>
+              </w:rPr>
+              <w:t xml:space="preserve">DHCP</w:t>
+            </w:r>
+          </w:p>
+        </w:tc>
+        <w:tc>
+          <w:tcPr>
+            <w:tcW w:type="dxa" w:w="8080"/>
+            <w:tcMar>
+              <w:top w:type="dxa" w:w="60"/>
+              <w:left w:type="dxa" w:w="100"/>
+              <w:bottom w:type="dxa" w:w="60"/>
+              <w:right w:type="dxa" w:w="100"/>
+            </w:tcMar>
+          </w:tcPr>
+          <w:p>
+            <w:pPr>
+              <w:spacing w:after="0" w:line="260"/>
+            </w:pPr>
+            <w:r>
+              <w:rPr>
+                <w:rFonts w:ascii="Calibri" w:cs="Calibri" w:eastAsia="Calibri" w:hAnsi="Calibri"/>
+                <w:b w:val="false"/>
+                <w:bCs w:val="false"/>
+                <w:sz w:val="20"/>
+                <w:szCs w:val="20"/>
+              </w:rPr>
+              <w:t xml:space="preserve">Which server answered, with the gateway, mask and DNS it handed out. "Clients asking, nobody answering" is the dead-server signature.</w:t>
+            </w:r>
+          </w:p>
+        </w:tc>
+      </w:tr>
+      <w:tr>
+        <w:trPr>
+          <w:tblHeader w:val="off"/>
+        </w:trPr>
+        <w:tc>
+          <w:tcPr>
+            <w:tcW w:type="dxa" w:w="2000"/>
+            <w:tcMar>
+              <w:top w:type="dxa" w:w="60"/>
+              <w:left w:type="dxa" w:w="100"/>
+              <w:bottom w:type="dxa" w:w="60"/>
+              <w:right w:type="dxa" w:w="100"/>
+            </w:tcMar>
+          </w:tcPr>
+          <w:p>
+            <w:pPr>
+              <w:spacing w:after="0" w:line="260"/>
+            </w:pPr>
+            <w:r>
+              <w:rPr>
+                <w:rFonts w:ascii="Calibri" w:cs="Calibri" w:eastAsia="Calibri" w:hAnsi="Calibri"/>
+                <w:b w:val="false"/>
+                <w:bCs w:val="false"/>
+                <w:sz w:val="20"/>
+                <w:szCs w:val="20"/>
+              </w:rPr>
+              <w:t xml:space="preserve">HOSTS</w:t>
+            </w:r>
+          </w:p>
+        </w:tc>
+        <w:tc>
+          <w:tcPr>
+            <w:tcW w:type="dxa" w:w="8080"/>
+            <w:tcMar>
+              <w:top w:type="dxa" w:w="60"/>
+              <w:left w:type="dxa" w:w="100"/>
+              <w:bottom w:type="dxa" w:w="60"/>
+              <w:right w:type="dxa" w:w="100"/>
+            </w:tcMar>
+          </w:tcPr>
+          <w:p>
+            <w:pPr>
+              <w:spacing w:after="0" w:line="260"/>
+            </w:pPr>
+            <w:r>
+              <w:rPr>
+                <w:rFonts w:ascii="Calibri" w:cs="Calibri" w:eastAsia="Calibri" w:hAnsi="Calibri"/>
+                <w:b w:val="false"/>
+                <w:bCs w:val="false"/>
+                <w:sz w:val="20"/>
+                <w:szCs w:val="20"/>
+              </w:rPr>
+              <w:t xml:space="preserve">How many addresses were heard and on which subnet. More than one subnet on an access port is worth a question.</w:t>
+            </w:r>
+          </w:p>
+        </w:tc>
+      </w:tr>
+      <w:tr>
+        <w:trPr>
+          <w:tblHeader w:val="off"/>
+        </w:trPr>
+        <w:tc>
+          <w:tcPr>
+            <w:tcW w:type="dxa" w:w="2000"/>
+            <w:tcMar>
+              <w:top w:type="dxa" w:w="60"/>
+              <w:left w:type="dxa" w:w="100"/>
+              <w:bottom w:type="dxa" w:w="60"/>
+              <w:right w:type="dxa" w:w="100"/>
+            </w:tcMar>
+          </w:tcPr>
+          <w:p>
+            <w:pPr>
+              <w:spacing w:after="0" w:line="260"/>
+            </w:pPr>
+            <w:r>
+              <w:rPr>
+                <w:rFonts w:ascii="Calibri" w:cs="Calibri" w:eastAsia="Calibri" w:hAnsi="Calibri"/>
+                <w:b w:val="false"/>
+                <w:bCs w:val="false"/>
+                <w:sz w:val="20"/>
+                <w:szCs w:val="20"/>
+              </w:rPr>
+              <w:t xml:space="preserve">ADDRESS</w:t>
+            </w:r>
+          </w:p>
+        </w:tc>
+        <w:tc>
+          <w:tcPr>
+            <w:tcW w:type="dxa" w:w="8080"/>
+            <w:tcMar>
+              <w:top w:type="dxa" w:w="60"/>
+              <w:left w:type="dxa" w:w="100"/>
+              <w:bottom w:type="dxa" w:w="60"/>
+              <w:right w:type="dxa" w:w="100"/>
+            </w:tcMar>
+          </w:tcPr>
+          <w:p>
+            <w:pPr>
+              <w:spacing w:after="0" w:line="260"/>
+            </w:pPr>
+            <w:r>
+              <w:rPr>
+                <w:rFonts w:ascii="Calibri" w:cs="Calibri" w:eastAsia="Calibri" w:hAnsi="Calibri"/>
+                <w:b w:val="false"/>
+                <w:bCs w:val="false"/>
+                <w:sz w:val="20"/>
+                <w:szCs w:val="20"/>
+              </w:rPr>
+              <w:t xml:space="preserve">A free-looking address on the busiest subnet, with the mask and gateway heard. TAKE puts it into the ETHER form; APPLY still runs the duplicate check.</w:t>
+            </w:r>
+          </w:p>
+        </w:tc>
+      </w:tr>
+      <w:tr>
+        <w:trPr>
+          <w:tblHeader w:val="off"/>
+        </w:trPr>
+        <w:tc>
+          <w:tcPr>
+            <w:tcW w:type="dxa" w:w="2000"/>
+            <w:tcMar>
+              <w:top w:type="dxa" w:w="60"/>
+              <w:left w:type="dxa" w:w="100"/>
+              <w:bottom w:type="dxa" w:w="60"/>
+              <w:right w:type="dxa" w:w="100"/>
+            </w:tcMar>
+          </w:tcPr>
+          <w:p>
+            <w:pPr>
+              <w:spacing w:after="0" w:line="260"/>
+            </w:pPr>
+            <w:r>
+              <w:rPr>
+                <w:rFonts w:ascii="Calibri" w:cs="Calibri" w:eastAsia="Calibri" w:hAnsi="Calibri"/>
+                <w:b w:val="false"/>
+                <w:bCs w:val="false"/>
+                <w:sz w:val="20"/>
+                <w:szCs w:val="20"/>
+              </w:rPr>
+              <w:t xml:space="preserve">NAMES / NTP</w:t>
+            </w:r>
+          </w:p>
+        </w:tc>
+        <w:tc>
+          <w:tcPr>
+            <w:tcW w:type="dxa" w:w="8080"/>
+            <w:tcMar>
+              <w:top w:type="dxa" w:w="60"/>
+              <w:left w:type="dxa" w:w="100"/>
+              <w:bottom w:type="dxa" w:w="60"/>
+              <w:right w:type="dxa" w:w="100"/>
+            </w:tcMar>
+          </w:tcPr>
+          <w:p>
+            <w:pPr>
+              <w:spacing w:after="0" w:line="260"/>
+            </w:pPr>
+            <w:r>
+              <w:rPr>
+                <w:rFonts w:ascii="Calibri" w:cs="Calibri" w:eastAsia="Calibri" w:hAnsi="Calibri"/>
+                <w:b w:val="false"/>
+                <w:bCs w:val="false"/>
+                <w:sz w:val="20"/>
+                <w:szCs w:val="20"/>
+              </w:rPr>
+              <w:t xml:space="preserve">NetBIOS and mDNS names hosts announced; time servers clients are asking.</w:t>
+            </w:r>
+          </w:p>
+        </w:tc>
+      </w:tr>
+    </w:tbl>
+    <w:p>
+      <w:pPr>
+        <w:spacing w:after="120"/>
+      </w:pPr>
+    </w:p>
+    <w:p>
+      <w:pPr>
+        <w:pStyle w:val="ListParagraph"/>
+        <w:numPr>
+          <w:ilvl w:val="0"/>
+          <w:numId w:val="2"/>
+        </w:numPr>
+        <w:spacing w:after="80" w:line="276"/>
+      </w:pPr>
+      <w:r>
+        <w:rPr>
+          <w:rFonts w:ascii="Calibri" w:cs="Calibri" w:eastAsia="Calibri" w:hAnsi="Calibri"/>
+          <w:sz w:val="22"/>
+          <w:szCs w:val="22"/>
+        </w:rPr>
+        <w:t xml:space="preserve">STANDARD leaves the adapter as it is; Windows itself still chatters (DHCP, NetBIOS, LLMNR), which is why a STANDARD listen finds the DHCP server — it asked.</w:t>
+      </w:r>
+    </w:p>
+    <w:p>
+      <w:pPr>
+        <w:pStyle w:val="ListParagraph"/>
+        <w:numPr>
+          <w:ilvl w:val="0"/>
+          <w:numId w:val="2"/>
+        </w:numPr>
+        <w:spacing w:after="80" w:line="276"/>
+      </w:pPr>
+      <w:r>
+        <w:rPr>
+          <w:rFonts w:ascii="Calibri" w:cs="Calibri" w:eastAsia="Calibri" w:hAnsi="Calibri"/>
+          <w:sz w:val="22"/>
+          <w:szCs w:val="22"/>
+        </w:rPr>
+        <w:t xml:space="preserve">SILENT unbinds IPv4 and IPv6 from the adapter for the listen so nothing leaves the port, not even a DHCP request, then restores them: when the listen ends, when you stop it, when you quit, and on the next launch if the app was force-closed. The app checks that Windows really recreated the IPv4 interface and asks for a DHCP lease again if one doesn't come back on its own. The DHCP server, if running, pauses while SILENT has the adapter.</w:t>
+      </w:r>
+    </w:p>
+    <w:p>
+      <w:pPr>
+        <w:pStyle w:val="ListParagraph"/>
+        <w:numPr>
+          <w:ilvl w:val="0"/>
+          <w:numId w:val="2"/>
+        </w:numPr>
+        <w:spacing w:after="80" w:line="276"/>
+      </w:pPr>
+      <w:r>
+        <w:rPr>
+          <w:rFonts w:ascii="Calibri" w:cs="Calibri" w:eastAsia="Calibri" w:hAnsi="Calibri"/>
+          <w:sz w:val="22"/>
+          <w:szCs w:val="22"/>
+        </w:rPr>
+        <w:t xml:space="preserve">WIRESHARK opens the whole adapter live, unfiltered. COPY puts the verdicts on the clipboard; they also go into the SITE REPORT.</w:t>
       </w:r>
     </w:p>
     <w:p>
@@ -3080,7 +4031,7 @@
           <w:sz w:val="22"/>
           <w:szCs w:val="22"/>
         </w:rPr>
-        <w:t xml:space="preserve">If something doesn't work, that report is what to send. It says exactly what Windows was asked to do and what Windows said back.</w:t>
+        <w:t xml:space="preserve">RECON needs Wireshark 4.6 or newer with npcap. Many Windows NIC drivers strip 802.1Q tags before the capture sees them, so a trunk is recognised from per-VLAN BPDUs and CDP/LLDP as much as from tags.</w:t>
       </w:r>
     </w:p>
     <w:p>
@@ -3097,7 +4048,127 @@
           <w:sz w:val="32"/>
           <w:szCs w:val="32"/>
         </w:rPr>
-        <w:t xml:space="preserve">9. Common workflows</w:t>
+        <w:t xml:space="preserve">9. DIAGNOSTICS</w:t>
+      </w:r>
+    </w:p>
+    <w:p>
+      <w:pPr>
+        <w:spacing w:after="120" w:line="276"/>
+      </w:pPr>
+      <w:r>
+        <w:rPr>
+          <w:rFonts w:ascii="Calibri" w:cs="Calibri" w:eastAsia="Calibri" w:hAnsi="Calibri"/>
+          <w:sz w:val="22"/>
+          <w:szCs w:val="22"/>
+        </w:rPr>
+        <w:t xml:space="preserve">Version chip → DIAGNOSTICS.</w:t>
+      </w:r>
+    </w:p>
+    <w:p>
+      <w:pPr>
+        <w:pStyle w:val="ListParagraph"/>
+        <w:numPr>
+          <w:ilvl w:val="0"/>
+          <w:numId w:val="2"/>
+        </w:numPr>
+        <w:spacing w:after="80" w:line="276"/>
+      </w:pPr>
+      <w:r>
+        <w:rPr>
+          <w:rFonts w:ascii="Calibri" w:cs="Calibri" w:eastAsia="Calibri" w:hAnsi="Calibri"/>
+          <w:sz w:val="22"/>
+          <w:szCs w:val="22"/>
+        </w:rPr>
+        <w:t xml:space="preserve">TOOLS — MTU → 1500 for the adapter selected in ETHER.</w:t>
+      </w:r>
+    </w:p>
+    <w:p>
+      <w:pPr>
+        <w:pStyle w:val="ListParagraph"/>
+        <w:numPr>
+          <w:ilvl w:val="0"/>
+          <w:numId w:val="2"/>
+        </w:numPr>
+        <w:spacing w:after="80" w:line="276"/>
+      </w:pPr>
+      <w:r>
+        <w:rPr>
+          <w:rFonts w:ascii="Calibri" w:cs="Calibri" w:eastAsia="Calibri" w:hAnsi="Calibri"/>
+          <w:sz w:val="22"/>
+          <w:szCs w:val="22"/>
+        </w:rPr>
+        <w:t xml:space="preserve">STATE — version, whether the app is elevated, your user and machine, where the data lives, Wireshark and tshark, credential storage status, the DHCP engine's state, and any policy in effect.</w:t>
+      </w:r>
+    </w:p>
+    <w:p>
+      <w:pPr>
+        <w:pStyle w:val="ListParagraph"/>
+        <w:numPr>
+          <w:ilvl w:val="0"/>
+          <w:numId w:val="2"/>
+        </w:numPr>
+        <w:spacing w:after="80" w:line="276"/>
+      </w:pPr>
+      <w:r>
+        <w:rPr>
+          <w:rFonts w:ascii="Calibri" w:cs="Calibri" w:eastAsia="Calibri" w:hAnsi="Calibri"/>
+          <w:sz w:val="22"/>
+          <w:szCs w:val="22"/>
+        </w:rPr>
+        <w:t xml:space="preserve">LOG — every adapter change the app made, with the exact commands run, their output, and whether the change was confirmed. Also launches, backups, imports, DHCP engine and firewall changes, rogue-server scans, discovery and RECON summaries, Wake-on-LAN, port blinks and name-resolution timings. Survives restarts.</w:t>
+      </w:r>
+    </w:p>
+    <w:p>
+      <w:pPr>
+        <w:pStyle w:val="ListParagraph"/>
+        <w:numPr>
+          <w:ilvl w:val="0"/>
+          <w:numId w:val="2"/>
+        </w:numPr>
+        <w:spacing w:after="80" w:line="276"/>
+      </w:pPr>
+      <w:r>
+        <w:rPr>
+          <w:rFonts w:ascii="Calibri" w:cs="Calibri" w:eastAsia="Calibri" w:hAnsi="Calibri"/>
+          <w:sz w:val="22"/>
+          <w:szCs w:val="22"/>
+        </w:rPr>
+        <w:t xml:space="preserve">COPY DIAGNOSTICS — puts a plain-text report on the clipboard.</w:t>
+      </w:r>
+    </w:p>
+    <w:p>
+      <w:pPr>
+        <w:pBdr>
+          <w:left w:val="single" w:color="00875A" w:sz="18" w:space="8"/>
+        </w:pBdr>
+        <w:shd w:fill="F2F2F2" w:color="auto" w:val="clear"/>
+        <w:spacing w:after="160" w:before="80" w:line="276"/>
+        <w:ind w:left="360"/>
+      </w:pPr>
+      <w:r>
+        <w:rPr>
+          <w:rFonts w:ascii="Calibri" w:cs="Calibri" w:eastAsia="Calibri" w:hAnsi="Calibri"/>
+          <w:sz w:val="22"/>
+          <w:szCs w:val="22"/>
+        </w:rPr>
+        <w:t xml:space="preserve">If something doesn't work, that report is what to send. It says exactly what Windows was asked to do and what Windows said back.</w:t>
+      </w:r>
+    </w:p>
+    <w:p>
+      <w:pPr>
+        <w:pStyle w:val="Heading1"/>
+        <w:spacing w:after="160" w:before="360"/>
+      </w:pPr>
+      <w:r>
+        <w:rPr>
+          <w:rFonts w:ascii="Calibri" w:cs="Calibri" w:eastAsia="Calibri" w:hAnsi="Calibri"/>
+          <w:b/>
+          <w:bCs/>
+          <w:color w:val="00875A"/>
+          <w:sz w:val="32"/>
+          <w:szCs w:val="32"/>
+        </w:rPr>
+        <w:t xml:space="preserve">10. Common workflows</w:t>
       </w:r>
     </w:p>
     <w:p>
@@ -3127,7 +4198,7 @@
           <w:sz w:val="22"/>
           <w:szCs w:val="22"/>
         </w:rPr>
-        <w:t xml:space="preserve">Plug in. ETHER shows the adapter and its current state in LIVE. Pick a preset or a Factory Default, APPLY, and the status line, the IP field and the top bar all confirm the change. If the device you need is on a second subnet, add a Multi-IP instead of changing your primary.</w:t>
+        <w:t xml:space="preserve">Plug in. ETHER shows the adapter, its link speed and its current state in LIVE. Not sure what the port is? RECON → LISTEN: in a minute you know the switch and port you are on, whether it wants 802.1X, which VLAN, who hands out addresses, and a free address you could take. Then pick a preset or a Factory Default, APPLY, and the status line, the IP field and the top bar all confirm the change. If the device you need is on a second subnet, add a Multi-IP instead of changing your primary.</w:t>
       </w:r>
     </w:p>
     <w:p>
@@ -3204,7 +4275,7 @@
           <w:sz w:val="26"/>
           <w:szCs w:val="26"/>
         </w:rPr>
-        <w:t xml:space="preserve">Finding which cable is which</w:t>
+        <w:t xml:space="preserve">A factory-default camera</w:t>
       </w:r>
     </w:p>
     <w:p>
@@ -3217,7 +4288,7 @@
           <w:sz w:val="22"/>
           <w:szCs w:val="22"/>
         </w:rPr>
-        <w:t xml:space="preserve">PING the device, press ♪ on its row, walk to the switch. Pull cables until the sonar turns into the alarm; that's the one.</w:t>
+        <w:t xml:space="preserve">SCAN → DISCOVER. The camera shows up on its 169.254 address with an ONVIF badge even though your laptop is on 192.168. Press REACH: a link-local alias goes on your adapter and the camera's web page opens. Give it its real address, then REMOVE on the chip (or just quit).</w:t>
       </w:r>
     </w:p>
     <w:p>
@@ -3234,7 +4305,7 @@
           <w:sz w:val="26"/>
           <w:szCs w:val="26"/>
         </w:rPr>
-        <w:t xml:space="preserve">Finding a camera that's stopped answering</w:t>
+        <w:t xml:space="preserve">Finding which cable is which</w:t>
       </w:r>
     </w:p>
     <w:p>
@@ -3247,7 +4318,7 @@
           <w:sz w:val="22"/>
           <w:szCs w:val="22"/>
         </w:rPr>
-        <w:t xml:space="preserve">SITES → the site → SCAN NOW. When the sweep finishes, the change chip tells you if it's MISSING (not on the wire), MOVED (new IP — usually DHCP), or present with a different open-port pattern (rebooted into a bad state). VIEW → shows which.</w:t>
+        <w:t xml:space="preserve">PING the device, press ♪ on its row, walk to the switch. Pull cables until the sonar turns into the alarm; that's the one. Or press ⚡ BLINK and watch for the port LED that strobes — no pulling needed.</w:t>
       </w:r>
     </w:p>
     <w:p>
@@ -3264,7 +4335,7 @@
           <w:sz w:val="26"/>
           <w:szCs w:val="26"/>
         </w:rPr>
-        <w:t xml:space="preserve">"It pings but the web page won't load"</w:t>
+        <w:t xml:space="preserve">Finding a camera that's stopped answering</w:t>
       </w:r>
     </w:p>
     <w:p>
@@ -3277,7 +4348,7 @@
           <w:sz w:val="22"/>
           <w:szCs w:val="22"/>
         </w:rPr>
-        <w:t xml:space="preserve">Version chip → DIAGNOSTICS → MTU → 1500. If the adapter was left at a jumbo or PPPoE-sized MTU by something else, one click fixes it.</w:t>
+        <w:t xml:space="preserve">SITES → the site → SCAN NOW. When the sweep finishes, the change chip tells you if it's MISSING (not on the wire), MOVED (new IP — usually DHCP), or present with a different open-port pattern (rebooted into a bad state). VIEW → shows which.</w:t>
       </w:r>
     </w:p>
     <w:p>
@@ -3294,6 +4365,36 @@
           <w:sz w:val="26"/>
           <w:szCs w:val="26"/>
         </w:rPr>
+        <w:t xml:space="preserve">"It pings but the web page won't load"</w:t>
+      </w:r>
+    </w:p>
+    <w:p>
+      <w:pPr>
+        <w:spacing w:after="120" w:line="276"/>
+      </w:pPr>
+      <w:r>
+        <w:rPr>
+          <w:rFonts w:ascii="Calibri" w:cs="Calibri" w:eastAsia="Calibri" w:hAnsi="Calibri"/>
+          <w:sz w:val="22"/>
+          <w:szCs w:val="22"/>
+        </w:rPr>
+        <w:t xml:space="preserve">Version chip → DIAGNOSTICS → MTU → 1500. If the adapter was left at a jumbo or PPPoE-sized MTU by something else, one click fixes it.</w:t>
+      </w:r>
+    </w:p>
+    <w:p>
+      <w:pPr>
+        <w:pStyle w:val="Heading2"/>
+        <w:spacing w:after="100" w:before="240"/>
+      </w:pPr>
+      <w:r>
+        <w:rPr>
+          <w:rFonts w:ascii="Calibri" w:cs="Calibri" w:eastAsia="Calibri" w:hAnsi="Calibri"/>
+          <w:b/>
+          <w:bCs/>
+          <w:color w:val="222222"/>
+          <w:sz w:val="26"/>
+          <w:szCs w:val="26"/>
+        </w:rPr>
         <w:t xml:space="preserve">Handing a site to another technician</w:t>
       </w:r>
     </w:p>
@@ -3308,6 +4409,36 @@
           <w:szCs w:val="22"/>
         </w:rPr>
         <w:t xml:space="preserve">SITES → EXCEL for a document they can read anywhere, or JSON if they also run NET//ETHER and should import the records.</w:t>
+      </w:r>
+    </w:p>
+    <w:p>
+      <w:pPr>
+        <w:pStyle w:val="Heading2"/>
+        <w:spacing w:after="100" w:before="240"/>
+      </w:pPr>
+      <w:r>
+        <w:rPr>
+          <w:rFonts w:ascii="Calibri" w:cs="Calibri" w:eastAsia="Calibri" w:hAnsi="Calibri"/>
+          <w:b/>
+          <w:bCs/>
+          <w:color w:val="222222"/>
+          <w:sz w:val="26"/>
+          <w:szCs w:val="26"/>
+        </w:rPr>
+        <w:t xml:space="preserve">Writing the ticket</w:t>
+      </w:r>
+    </w:p>
+    <w:p>
+      <w:pPr>
+        <w:spacing w:after="120" w:line="276"/>
+      </w:pPr>
+      <w:r>
+        <w:rPr>
+          <w:rFonts w:ascii="Calibri" w:cs="Calibri" w:eastAsia="Calibri" w:hAnsi="Calibri"/>
+          <w:sz w:val="22"/>
+          <w:szCs w:val="22"/>
+        </w:rPr>
+        <w:t xml:space="preserve">Version chip → SITE REPORT. One click copies what this session did — adapter and switch port, scans and site changes, RECON verdicts, DHCP leases, ping results, every privileged command with its time — as markdown. Paste it in.</w:t>
       </w:r>
     </w:p>
     <w:p>
@@ -3324,7 +4455,7 @@
           <w:sz w:val="32"/>
           <w:szCs w:val="32"/>
         </w:rPr>
-        <w:t xml:space="preserve">10. Data and privacy</w:t>
+        <w:t xml:space="preserve">11. Data and privacy</w:t>
       </w:r>
     </w:p>
     <w:p>
@@ -3431,6 +4562,42 @@
           <w:szCs w:val="22"/>
         </w:rPr>
         <w:t xml:space="preserve">The DHCP server listens only while the DHCP tab has been opened, adds one inbound firewall rule for that port while it runs, and removes it when it stops or the app quits.</w:t>
+      </w:r>
+    </w:p>
+    <w:p>
+      <w:pPr>
+        <w:pStyle w:val="ListParagraph"/>
+        <w:numPr>
+          <w:ilvl w:val="0"/>
+          <w:numId w:val="2"/>
+        </w:numPr>
+        <w:spacing w:after="80" w:line="276"/>
+      </w:pPr>
+      <w:r>
+        <w:rPr>
+          <w:rFonts w:ascii="Calibri" w:cs="Calibri" w:eastAsia="Calibri" w:hAnsi="Calibri"/>
+          <w:sz w:val="22"/>
+          <w:szCs w:val="22"/>
+        </w:rPr>
+        <w:t xml:space="preserve">Discovery sends three multicast probes per scan; BLINK and Wake-on-LAN send small UDP packets only when you press them; RECON transmits nothing. Everything the app sends is listed, with the command and its output, in the diagnostics log and in FUNCTIONS.md in the source repository.</w:t>
+      </w:r>
+    </w:p>
+    <w:p>
+      <w:pPr>
+        <w:pStyle w:val="ListParagraph"/>
+        <w:numPr>
+          <w:ilvl w:val="0"/>
+          <w:numId w:val="2"/>
+        </w:numPr>
+        <w:spacing w:after="80" w:line="276"/>
+      </w:pPr>
+      <w:r>
+        <w:rPr>
+          <w:rFonts w:ascii="Calibri" w:cs="Calibri" w:eastAsia="Calibri" w:hAnsi="Calibri"/>
+          <w:sz w:val="22"/>
+          <w:szCs w:val="22"/>
+        </w:rPr>
+        <w:t xml:space="preserve">Releases are code-signed. The application cannot be used as a general Node.js runtime by other software on the laptop (Electron fuses).</w:t>
       </w:r>
     </w:p>
     <w:p>
@@ -3527,10 +4694,6 @@
 </w:document>
 </file>
 
-<file path=word/comments.xml><?xml version="1.0" encoding="utf-8"?>
-<w:comments xmlns:cx="http://schemas.microsoft.com/office/drawing/2014/chartex" xmlns:cx1="http://schemas.microsoft.com/office/drawing/2015/9/8/chartex" xmlns:cx2="http://schemas.microsoft.com/office/drawing/2015/10/21/chartex" xmlns:cx3="http://schemas.microsoft.com/office/drawing/2016/5/9/chartex" xmlns:cx4="http://schemas.microsoft.com/office/drawing/2016/5/10/chartex" xmlns:cx5="http://schemas.microsoft.com/office/drawing/2016/5/11/chartex" xmlns:cx6="http://schemas.microsoft.com/office/drawing/2016/5/12/chartex" xmlns:cx7="http://schemas.microsoft.com/office/drawing/2016/5/13/chartex" xmlns:cx8="http://schemas.microsoft.com/office/drawing/2016/5/14/chartex" xmlns:mc="http://schemas.openxmlformats.org/markup-compatibility/2006" xmlns:aink="http://schemas.microsoft.com/office/drawing/2016/ink" xmlns:am3d="http://schemas.microsoft.com/office/drawing/2017/model3d" xmlns:o="urn:schemas-microsoft-com:office:office" xmlns:r="http://schemas.openxmlformats.org/officeDocument/2006/relationships" xmlns:m="http://schemas.openxmlformats.org/officeDocument/2006/math" xmlns:v="urn:schemas-microsoft-com:vml" xmlns:wp14="http://schemas.microsoft.com/office/word/2010/wordprocessingDrawing" xmlns:wp="http://schemas.openxmlformats.org/drawingml/2006/wordprocessingDrawing" xmlns:w10="urn:schemas-microsoft-com:office:word" xmlns:w="http://schemas.openxmlformats.org/wordprocessingml/2006/main" xmlns:w14="http://schemas.microsoft.com/office/word/2010/wordml" xmlns:w15="http://schemas.microsoft.com/office/word/2012/wordml" xmlns:w16cex="http://schemas.microsoft.com/office/word/2018/wordml/cex" xmlns:w16cid="http://schemas.microsoft.com/office/word/2016/wordml/cid" xmlns:w16="http://schemas.microsoft.com/office/word/2018/wordml" xmlns:w16sdtdh="http://schemas.microsoft.com/office/word/2020/wordml/sdtdatahash" xmlns:w16se="http://schemas.microsoft.com/office/word/2015/wordml/symex" xmlns:wpg="http://schemas.microsoft.com/office/word/2010/wordprocessingGroup" xmlns:wpi="http://schemas.microsoft.com/office/word/2010/wordprocessingInk" xmlns:wne="http://schemas.microsoft.com/office/word/2006/wordml" xmlns:wps="http://schemas.microsoft.com/office/word/2010/wordprocessingShape"/>
-</file>
-
 <file path=word/endnotes.xml><?xml version="1.0" encoding="utf-8"?>
 <w:endnotes xmlns:wpc="http://schemas.microsoft.com/office/word/2010/wordprocessingCanvas" xmlns:mc="http://schemas.openxmlformats.org/markup-compatibility/2006" xmlns:o="urn:schemas-microsoft-com:office:office" xmlns:r="http://schemas.openxmlformats.org/officeDocument/2006/relationships" xmlns:m="http://schemas.openxmlformats.org/officeDocument/2006/math" xmlns:v="urn:schemas-microsoft-com:vml" xmlns:wp14="http://schemas.microsoft.com/office/word/2010/wordprocessingDrawing" xmlns:wp="http://schemas.openxmlformats.org/drawingml/2006/wordprocessingDrawing" xmlns:w10="urn:schemas-microsoft-com:office:word" xmlns:w="http://schemas.openxmlformats.org/wordprocessingml/2006/main" xmlns:w14="http://schemas.microsoft.com/office/word/2010/wordml" xmlns:w15="http://schemas.microsoft.com/office/word/2012/wordml" xmlns:wpg="http://schemas.microsoft.com/office/word/2010/wordprocessingGroup" xmlns:wpi="http://schemas.microsoft.com/office/word/2010/wordprocessingInk" xmlns:wne="http://schemas.microsoft.com/office/word/2006/wordml" xmlns:wps="http://schemas.microsoft.com/office/word/2010/wordprocessingShape" mc:Ignorable="w14 w15 wp14">
   <w:endnote w:type="separator" w:id="-1">
@@ -3609,7 +4772,7 @@
 <w:numbering xmlns:wpc="http://schemas.microsoft.com/office/word/2010/wordprocessingCanvas" xmlns:mc="http://schemas.openxmlformats.org/markup-compatibility/2006" xmlns:o="urn:schemas-microsoft-com:office:office" xmlns:r="http://schemas.openxmlformats.org/officeDocument/2006/relationships" xmlns:m="http://schemas.openxmlformats.org/officeDocument/2006/math" xmlns:v="urn:schemas-microsoft-com:vml" xmlns:wp14="http://schemas.microsoft.com/office/word/2010/wordprocessingDrawing" xmlns:wp="http://schemas.openxmlformats.org/drawingml/2006/wordprocessingDrawing" xmlns:w10="urn:schemas-microsoft-com:office:word" xmlns:w="http://schemas.openxmlformats.org/wordprocessingml/2006/main" xmlns:w14="http://schemas.microsoft.com/office/word/2010/wordml" xmlns:w15="http://schemas.microsoft.com/office/word/2012/wordml" xmlns:wpg="http://schemas.microsoft.com/office/word/2010/wordprocessingGroup" xmlns:wpi="http://schemas.microsoft.com/office/word/2010/wordprocessingInk" xmlns:wne="http://schemas.microsoft.com/office/word/2006/wordml" xmlns:wps="http://schemas.microsoft.com/office/word/2010/wordprocessingShape" mc:Ignorable="w14 w15 wp14">
   <w:abstractNum w:abstractNumId="1" w15:restartNumberingAfterBreak="0">
     <w:multiLevelType w:val="hybridMultilevel"/>
-    <w:lvl w:ilvl="0" w15:tentative="1">
+    <w:lvl w:ilvl="0" w:tentative="1">
       <w:start w:val="1"/>
       <w:numFmt w:val="bullet"/>
       <w:lvlText w:val="●"/>
@@ -3618,7 +4781,7 @@
         <w:ind w:left="720" w:hanging="360"/>
       </w:pPr>
     </w:lvl>
-    <w:lvl w:ilvl="1" w15:tentative="1">
+    <w:lvl w:ilvl="1" w:tentative="1">
       <w:start w:val="1"/>
       <w:numFmt w:val="bullet"/>
       <w:lvlText w:val="○"/>
@@ -3627,7 +4790,7 @@
         <w:ind w:left="1440" w:hanging="360"/>
       </w:pPr>
     </w:lvl>
-    <w:lvl w:ilvl="2" w15:tentative="1">
+    <w:lvl w:ilvl="2" w:tentative="1">
       <w:start w:val="1"/>
       <w:numFmt w:val="bullet"/>
       <w:lvlText w:val="■"/>
@@ -3636,7 +4799,7 @@
         <w:ind w:left="2160" w:hanging="360"/>
       </w:pPr>
     </w:lvl>
-    <w:lvl w:ilvl="3" w15:tentative="1">
+    <w:lvl w:ilvl="3" w:tentative="1">
       <w:start w:val="1"/>
       <w:numFmt w:val="bullet"/>
       <w:lvlText w:val="●"/>
@@ -3645,7 +4808,7 @@
         <w:ind w:left="2880" w:hanging="360"/>
       </w:pPr>
     </w:lvl>
-    <w:lvl w:ilvl="4" w15:tentative="1">
+    <w:lvl w:ilvl="4" w:tentative="1">
       <w:start w:val="1"/>
       <w:numFmt w:val="bullet"/>
       <w:lvlText w:val="○"/>
@@ -3654,7 +4817,7 @@
         <w:ind w:left="3600" w:hanging="360"/>
       </w:pPr>
     </w:lvl>
-    <w:lvl w:ilvl="5" w15:tentative="1">
+    <w:lvl w:ilvl="5" w:tentative="1">
       <w:start w:val="1"/>
       <w:numFmt w:val="bullet"/>
       <w:lvlText w:val="■"/>
@@ -3663,7 +4826,7 @@
         <w:ind w:left="4320" w:hanging="360"/>
       </w:pPr>
     </w:lvl>
-    <w:lvl w:ilvl="6" w15:tentative="1">
+    <w:lvl w:ilvl="6" w:tentative="1">
       <w:start w:val="1"/>
       <w:numFmt w:val="bullet"/>
       <w:lvlText w:val="●"/>
@@ -3672,7 +4835,7 @@
         <w:ind w:left="5040" w:hanging="360"/>
       </w:pPr>
     </w:lvl>
-    <w:lvl w:ilvl="7" w15:tentative="1">
+    <w:lvl w:ilvl="7" w:tentative="1">
       <w:start w:val="1"/>
       <w:numFmt w:val="bullet"/>
       <w:lvlText w:val="●"/>
@@ -3681,7 +4844,7 @@
         <w:ind w:left="5760" w:hanging="360"/>
       </w:pPr>
     </w:lvl>
-    <w:lvl w:ilvl="8" w15:tentative="1">
+    <w:lvl w:ilvl="8" w:tentative="1">
       <w:start w:val="1"/>
       <w:numFmt w:val="bullet"/>
       <w:lvlText w:val="●"/>
@@ -3693,7 +4856,7 @@
   </w:abstractNum>
   <w:abstractNum w:abstractNumId="2" w15:restartNumberingAfterBreak="0">
     <w:multiLevelType w:val="hybridMultilevel"/>
-    <w:lvl w:ilvl="0" w15:tentative="1">
+    <w:lvl w:ilvl="0" w:tentative="1">
       <w:start w:val="1"/>
       <w:numFmt w:val="bullet"/>
       <w:lvlText w:val="•"/>
@@ -3730,6 +4893,10 @@
     </w:rPrDefault>
     <w:pPrDefault/>
   </w:docDefaults>
+  <w:style w:type="paragraph" w:styleId="Normal" w:default="1">
+    <w:name w:val="Normal"/>
+    <w:qFormat/>
+  </w:style>
   <w:style w:type="paragraph" w:styleId="Title">
     <w:name w:val="Title"/>
     <w:basedOn w:val="Normal"/>
@@ -3902,4 +5069,294 @@
     </w:rPr>
   </w:style>
 </w:styles>
+</file>
+
+<file path=word/theme/theme1.xml><?xml version="1.0" encoding="utf-8"?>
+<a:theme xmlns:a="http://schemas.openxmlformats.org/drawingml/2006/main" name="Office Theme">
+  <a:themeElements>
+    <a:clrScheme name="Office">
+      <a:dk1>
+        <a:sysClr val="windowText" lastClr="000000"/>
+      </a:dk1>
+      <a:lt1>
+        <a:sysClr val="window" lastClr="FFFFFF"/>
+      </a:lt1>
+      <a:dk2>
+        <a:srgbClr val="44546A"/>
+      </a:dk2>
+      <a:lt2>
+        <a:srgbClr val="E7E6E6"/>
+      </a:lt2>
+      <a:accent1>
+        <a:srgbClr val="4472C4"/>
+      </a:accent1>
+      <a:accent2>
+        <a:srgbClr val="ED7D31"/>
+      </a:accent2>
+      <a:accent3>
+        <a:srgbClr val="A5A5A5"/>
+      </a:accent3>
+      <a:accent4>
+        <a:srgbClr val="FFC000"/>
+      </a:accent4>
+      <a:accent5>
+        <a:srgbClr val="5B9BD5"/>
+      </a:accent5>
+      <a:accent6>
+        <a:srgbClr val="70AD47"/>
+      </a:accent6>
+      <a:hlink>
+        <a:srgbClr val="0563C1"/>
+      </a:hlink>
+      <a:folHlink>
+        <a:srgbClr val="954F72"/>
+      </a:folHlink>
+    </a:clrScheme>
+    <a:fontScheme name="Office">
+      <a:majorFont>
+        <a:latin typeface="Calibri Light" panose="020F0302020204030204"/>
+        <a:ea typeface=""/>
+        <a:cs typeface=""/>
+        <a:font script="Jpan" typeface="游ゴシック Light"/>
+        <a:font script="Hang" typeface="맑은 고딕"/>
+        <a:font script="Hans" typeface="等线 Light"/>
+        <a:font script="Hant" typeface="新細明體"/>
+        <a:font script="Arab" typeface="Times New Roman"/>
+        <a:font script="Hebr" typeface="Times New Roman"/>
+        <a:font script="Thai" typeface="Angsana New"/>
+        <a:font script="Ethi" typeface="Nyala"/>
+        <a:font script="Beng" typeface="Vrinda"/>
+        <a:font script="Gujr" typeface="Shruti"/>
+        <a:font script="Khmr" typeface="MoolBoran"/>
+        <a:font script="Knda" typeface="Tunga"/>
+        <a:font script="Guru" typeface="Raavi"/>
+        <a:font script="Cans" typeface="Euphemia"/>
+        <a:font script="Cher" typeface="Plantagenet Cherokee"/>
+        <a:font script="Yiii" typeface="Microsoft Yi Baiti"/>
+        <a:font script="Tibt" typeface="Microsoft Himalaya"/>
+        <a:font script="Thaa" typeface="MV Boli"/>
+        <a:font script="Deva" typeface="Mangal"/>
+        <a:font script="Telu" typeface="Gautami"/>
+        <a:font script="Taml" typeface="Latha"/>
+        <a:font script="Syrc" typeface="Estrangelo Edessa"/>
+        <a:font script="Orya" typeface="Kalinga"/>
+        <a:font script="Mlym" typeface="Kartika"/>
+        <a:font script="Laoo" typeface="DokChampa"/>
+        <a:font script="Sinh" typeface="Iskoola Pota"/>
+        <a:font script="Mong" typeface="Mongolian Baiti"/>
+        <a:font script="Viet" typeface="Times New Roman"/>
+        <a:font script="Uigh" typeface="Microsoft Uighur"/>
+        <a:font script="Geor" typeface="Sylfaen"/>
+        <a:font script="Armn" typeface="Arial"/>
+        <a:font script="Bugi" typeface="Leelawadee UI"/>
+        <a:font script="Bopo" typeface="Microsoft JhengHei"/>
+        <a:font script="Java" typeface="Javanese Text"/>
+        <a:font script="Lisu" typeface="Segoe UI"/>
+        <a:font script="Mymr" typeface="Myanmar Text"/>
+        <a:font script="Nkoo" typeface="Ebrima"/>
+        <a:font script="Olck" typeface="Nirmala UI"/>
+        <a:font script="Osma" typeface="Ebrima"/>
+        <a:font script="Phag" typeface="Phagspa"/>
+        <a:font script="Syrn" typeface="Estrangelo Edessa"/>
+        <a:font script="Syrj" typeface="Estrangelo Edessa"/>
+        <a:font script="Syre" typeface="Estrangelo Edessa"/>
+        <a:font script="Sora" typeface="Nirmala UI"/>
+        <a:font script="Tale" typeface="Microsoft Tai Le"/>
+        <a:font script="Talu" typeface="Microsoft New Tai Lue"/>
+        <a:font script="Tfng" typeface="Ebrima"/>
+      </a:majorFont>
+      <a:minorFont>
+        <a:latin typeface="Calibri" panose="020F0502020204030204"/>
+        <a:ea typeface=""/>
+        <a:cs typeface=""/>
+        <a:font script="Jpan" typeface="游明朝"/>
+        <a:font script="Hang" typeface="맑은 고딕"/>
+        <a:font script="Hans" typeface="等线"/>
+        <a:font script="Hant" typeface="新細明體"/>
+        <a:font script="Arab" typeface="Arial"/>
+        <a:font script="Hebr" typeface="Arial"/>
+        <a:font script="Thai" typeface="Cordia New"/>
+        <a:font script="Ethi" typeface="Nyala"/>
+        <a:font script="Beng" typeface="Vrinda"/>
+        <a:font script="Gujr" typeface="Shruti"/>
+        <a:font script="Khmr" typeface="DaunPenh"/>
+        <a:font script="Knda" typeface="Tunga"/>
+        <a:font script="Guru" typeface="Raavi"/>
+        <a:font script="Cans" typeface="Euphemia"/>
+        <a:font script="Cher" typeface="Plantagenet Cherokee"/>
+        <a:font script="Yiii" typeface="Microsoft Yi Baiti"/>
+        <a:font script="Tibt" typeface="Microsoft Himalaya"/>
+        <a:font script="Thaa" typeface="MV Boli"/>
+        <a:font script="Deva" typeface="Mangal"/>
+        <a:font script="Telu" typeface="Gautami"/>
+        <a:font script="Taml" typeface="Latha"/>
+        <a:font script="Syrc" typeface="Estrangelo Edessa"/>
+        <a:font script="Orya" typeface="Kalinga"/>
+        <a:font script="Mlym" typeface="Kartika"/>
+        <a:font script="Laoo" typeface="DokChampa"/>
+        <a:font script="Sinh" typeface="Iskoola Pota"/>
+        <a:font script="Mong" typeface="Mongolian Baiti"/>
+        <a:font script="Viet" typeface="Arial"/>
+        <a:font script="Uigh" typeface="Microsoft Uighur"/>
+        <a:font script="Geor" typeface="Sylfaen"/>
+        <a:font script="Armn" typeface="Arial"/>
+        <a:font script="Bugi" typeface="Leelawadee UI"/>
+        <a:font script="Bopo" typeface="Microsoft JhengHei"/>
+        <a:font script="Java" typeface="Javanese Text"/>
+        <a:font script="Lisu" typeface="Segoe UI"/>
+        <a:font script="Mymr" typeface="Myanmar Text"/>
+        <a:font script="Nkoo" typeface="Ebrima"/>
+        <a:font script="Olck" typeface="Nirmala UI"/>
+        <a:font script="Osma" typeface="Ebrima"/>
+        <a:font script="Phag" typeface="Phagspa"/>
+        <a:font script="Syrn" typeface="Estrangelo Edessa"/>
+        <a:font script="Syrj" typeface="Estrangelo Edessa"/>
+        <a:font script="Syre" typeface="Estrangelo Edessa"/>
+        <a:font script="Sora" typeface="Nirmala UI"/>
+        <a:font script="Tale" typeface="Microsoft Tai Le"/>
+        <a:font script="Talu" typeface="Microsoft New Tai Lue"/>
+        <a:font script="Tfng" typeface="Ebrima"/>
+      </a:minorFont>
+    </a:fontScheme>
+    <a:fmtScheme name="Office">
+      <a:fillStyleLst>
+        <a:solidFill>
+          <a:schemeClr val="phClr"/>
+        </a:solidFill>
+        <a:gradFill rotWithShape="true">
+          <a:gsLst>
+            <a:gs pos="0">
+              <a:schemeClr val="phClr">
+                <a:lumMod val="110000"/>
+                <a:satMod val="105000"/>
+                <a:tint val="67000"/>
+              </a:schemeClr>
+            </a:gs>
+            <a:gs pos="50000">
+              <a:schemeClr val="phClr">
+                <a:lumMod val="105000"/>
+                <a:satMod val="103000"/>
+                <a:tint val="73000"/>
+              </a:schemeClr>
+            </a:gs>
+            <a:gs pos="100000">
+              <a:schemeClr val="phClr">
+                <a:lumMod val="105000"/>
+                <a:satMod val="109000"/>
+                <a:tint val="81000"/>
+              </a:schemeClr>
+            </a:gs>
+          </a:gsLst>
+          <a:lin ang="5400000" scaled="false"/>
+        </a:gradFill>
+        <a:gradFill rotWithShape="true">
+          <a:gsLst>
+            <a:gs pos="0">
+              <a:schemeClr val="phClr">
+                <a:satMod val="103000"/>
+                <a:lumMod val="102000"/>
+                <a:tint val="94000"/>
+              </a:schemeClr>
+            </a:gs>
+            <a:gs pos="50000">
+              <a:schemeClr val="phClr">
+                <a:satMod val="110000"/>
+                <a:lumMod val="100000"/>
+                <a:shade val="100000"/>
+              </a:schemeClr>
+            </a:gs>
+            <a:gs pos="100000">
+              <a:schemeClr val="phClr">
+                <a:lumMod val="99000"/>
+                <a:satMod val="120000"/>
+                <a:shade val="78000"/>
+              </a:schemeClr>
+            </a:gs>
+          </a:gsLst>
+          <a:lin ang="5400000" scaled="false"/>
+        </a:gradFill>
+      </a:fillStyleLst>
+      <a:lnStyleLst>
+        <a:ln w="6350" cap="flat" cmpd="sng" algn="ctr">
+          <a:solidFill>
+            <a:schemeClr val="phClr"/>
+          </a:solidFill>
+          <a:prstDash val="solid"/>
+          <a:miter lim="800000"/>
+        </a:ln>
+        <a:ln w="12700" cap="flat" cmpd="sng" algn="ctr">
+          <a:solidFill>
+            <a:schemeClr val="phClr"/>
+          </a:solidFill>
+          <a:prstDash val="solid"/>
+          <a:miter lim="800000"/>
+        </a:ln>
+        <a:ln w="19050" cap="flat" cmpd="sng" algn="ctr">
+          <a:solidFill>
+            <a:schemeClr val="phClr"/>
+          </a:solidFill>
+          <a:prstDash val="solid"/>
+          <a:miter lim="800000"/>
+        </a:ln>
+      </a:lnStyleLst>
+      <a:effectStyleLst>
+        <a:effectStyle>
+          <a:effectLst/>
+        </a:effectStyle>
+        <a:effectStyle>
+          <a:effectLst/>
+        </a:effectStyle>
+        <a:effectStyle>
+          <a:effectLst>
+            <a:outerShdw blurRad="57150" dist="19050" dir="5400000" algn="ctr" rotWithShape="false">
+              <a:srgbClr val="000000">
+                <a:alpha val="63000"/>
+              </a:srgbClr>
+            </a:outerShdw>
+          </a:effectLst>
+        </a:effectStyle>
+      </a:effectStyleLst>
+      <a:bgFillStyleLst>
+        <a:solidFill>
+          <a:schemeClr val="phClr"/>
+        </a:solidFill>
+        <a:solidFill>
+          <a:schemeClr val="phClr">
+            <a:tint val="95000"/>
+            <a:satMod val="170000"/>
+          </a:schemeClr>
+        </a:solidFill>
+        <a:gradFill rotWithShape="true">
+          <a:gsLst>
+            <a:gs pos="0">
+              <a:schemeClr val="phClr">
+                <a:tint val="93000"/>
+                <a:satMod val="150000"/>
+                <a:shade val="98000"/>
+                <a:lumMod val="102000"/>
+              </a:schemeClr>
+            </a:gs>
+            <a:gs pos="50000">
+              <a:schemeClr val="phClr">
+                <a:tint val="98000"/>
+                <a:satMod val="130000"/>
+                <a:shade val="90000"/>
+                <a:lumMod val="103000"/>
+              </a:schemeClr>
+            </a:gs>
+            <a:gs pos="100000">
+              <a:schemeClr val="phClr">
+                <a:shade val="63000"/>
+                <a:satMod val="120000"/>
+              </a:schemeClr>
+            </a:gs>
+          </a:gsLst>
+          <a:lin ang="5400000" scaled="false"/>
+        </a:gradFill>
+      </a:bgFillStyleLst>
+    </a:fmtScheme>
+  </a:themeElements>
+  <a:objectDefaults/>
+  <a:extraClrSchemeLst/>
+</a:theme>
 </file>
</xml_diff>

<commit_message>
v7.2.0: IP tab rename, DHCP rework, wire watch, mDNS cross-subnet discovery, PS worker + process-launch diagnostics
DHCP: two-step card/laptop-IP header, one-device default, SERVE EVERYONE behind confirm, per-row IP + OPEN, auto-advance, plain-time lease (5 min default), went-static detection, option 60 model/fw, wrong-card guard. IP tab: wrong-address warning, HEAR THE WIRE, SET STATIC, RENEW. Discovery: multicast mDNS from 5353 + program-scoped firewall rule (removed on quit). spawn.js: launch timing, slow-laptop injector, persistent PowerShell worker. Docs + guide regenerated.
</commit_message>
<xml_diff>
--- a/assets/NET-ETHER-Guide.docx
+++ b/assets/NET-ETHER-Guide.docx
@@ -57,7 +57,7 @@
           <w:sz w:val="22"/>
           <w:szCs w:val="22"/>
         </w:rPr>
-        <w:t xml:space="preserve">Application version 7.1.0 · Document version 5.0</w:t>
+        <w:t xml:space="preserve">Application version 7.2.0 · Document version 5.1</w:t>
       </w:r>
     </w:p>
     <w:p>
@@ -730,7 +730,7 @@
           <w:sz w:val="22"/>
           <w:szCs w:val="22"/>
         </w:rPr>
-        <w:t xml:space="preserve">Some tabs are wide: SCAN and SITES open at 640 px or wider, DHCP at 820 or wider, so a host fits on one line. A window you dragged wider stays wider. ETHER, PING and RECON return to the width you keep for them. The minimum width is 430 — visible beats small.</w:t>
+        <w:t xml:space="preserve">Some tabs are wide: SCAN and SITES open at 640 px or wider, DHCP at 820 or wider, so a host fits on one line. A window you dragged wider stays wider. IP, PING and RECON return to the width you keep for them. The minimum width is 430 — visible beats small.</w:t>
       </w:r>
     </w:p>
     <w:p>
@@ -814,7 +814,7 @@
           <w:sz w:val="32"/>
           <w:szCs w:val="32"/>
         </w:rPr>
-        <w:t xml:space="preserve">3. ETHER — adapter configuration</w:t>
+        <w:t xml:space="preserve">3. IP — adapter configuration</w:t>
       </w:r>
     </w:p>
     <w:p>
@@ -1184,6 +1184,128 @@
           <w:sz w:val="26"/>
           <w:szCs w:val="26"/>
         </w:rPr>
+        <w:t xml:space="preserve">Wrong-address warning</w:t>
+      </w:r>
+    </w:p>
+    <w:p>
+      <w:pPr>
+        <w:spacing w:after="120" w:line="276"/>
+      </w:pPr>
+      <w:r>
+        <w:rPr>
+          <w:rFonts w:ascii="Calibri" w:cs="Calibri" w:eastAsia="Calibri" w:hAnsi="Calibri"/>
+          <w:sz w:val="22"/>
+          <w:szCs w:val="22"/>
+        </w:rPr>
+        <w:t xml:space="preserve">Move the cable from the office jack to a camera switch and Windows either keeps the last network's DHCP lease or falls back to 169.254.x.x. Either way the cameras' subnet isn't reachable. An amber line under the ADAPTER says which it is — a self-assigned 169.254 address, a lease whose gateway no longer answers, or no address at all — with three ways out:</w:t>
+      </w:r>
+    </w:p>
+    <w:p>
+      <w:pPr>
+        <w:pStyle w:val="ListParagraph"/>
+        <w:numPr>
+          <w:ilvl w:val="0"/>
+          <w:numId w:val="2"/>
+        </w:numPr>
+        <w:spacing w:after="80" w:line="276"/>
+      </w:pPr>
+      <w:r>
+        <w:rPr>
+          <w:rFonts w:ascii="Calibri" w:cs="Calibri" w:eastAsia="Calibri" w:hAnsi="Calibri"/>
+          <w:b/>
+          <w:bCs/>
+          <w:sz w:val="22"/>
+          <w:szCs w:val="22"/>
+        </w:rPr>
+        <w:t xml:space="preserve">HEAR THE WIRE</w:t>
+      </w:r>
+      <w:r>
+        <w:rPr>
+          <w:rFonts w:ascii="Calibri" w:cs="Calibri" w:eastAsia="Calibri" w:hAnsi="Calibri"/>
+          <w:sz w:val="22"/>
+          <w:szCs w:val="22"/>
+        </w:rPr>
+        <w:t xml:space="preserve"> listens for ten seconds (ARP, mDNS, device LLDP) and lists the subnets devices are actually using, each with a free address and a USE button that fills in the form. APPLY still runs the duplicate check.</w:t>
+      </w:r>
+    </w:p>
+    <w:p>
+      <w:pPr>
+        <w:pStyle w:val="ListParagraph"/>
+        <w:numPr>
+          <w:ilvl w:val="0"/>
+          <w:numId w:val="2"/>
+        </w:numPr>
+        <w:spacing w:after="80" w:line="276"/>
+      </w:pPr>
+      <w:r>
+        <w:rPr>
+          <w:rFonts w:ascii="Calibri" w:cs="Calibri" w:eastAsia="Calibri" w:hAnsi="Calibri"/>
+          <w:b/>
+          <w:bCs/>
+          <w:sz w:val="22"/>
+          <w:szCs w:val="22"/>
+        </w:rPr>
+        <w:t xml:space="preserve">SET STATIC…</w:t>
+      </w:r>
+      <w:r>
+        <w:rPr>
+          <w:rFonts w:ascii="Calibri" w:cs="Calibri" w:eastAsia="Calibri" w:hAnsi="Calibri"/>
+          <w:sz w:val="22"/>
+          <w:szCs w:val="22"/>
+        </w:rPr>
+        <w:t xml:space="preserve"> puts the cursor in the IP field. </w:t>
+      </w:r>
+      <w:r>
+        <w:rPr>
+          <w:rFonts w:ascii="Calibri" w:cs="Calibri" w:eastAsia="Calibri" w:hAnsi="Calibri"/>
+          <w:b/>
+          <w:bCs/>
+          <w:sz w:val="22"/>
+          <w:szCs w:val="22"/>
+        </w:rPr>
+        <w:t xml:space="preserve">RENEW</w:t>
+      </w:r>
+      <w:r>
+        <w:rPr>
+          <w:rFonts w:ascii="Calibri" w:cs="Calibri" w:eastAsia="Calibri" w:hAnsi="Calibri"/>
+          <w:sz w:val="22"/>
+          <w:szCs w:val="22"/>
+        </w:rPr>
+        <w:t xml:space="preserve"> asks DHCP again.</w:t>
+      </w:r>
+    </w:p>
+    <w:p>
+      <w:pPr>
+        <w:pStyle w:val="ListParagraph"/>
+        <w:numPr>
+          <w:ilvl w:val="0"/>
+          <w:numId w:val="2"/>
+        </w:numPr>
+        <w:spacing w:after="80" w:line="276"/>
+      </w:pPr>
+      <w:r>
+        <w:rPr>
+          <w:rFonts w:ascii="Calibri" w:cs="Calibri" w:eastAsia="Calibri" w:hAnsi="Calibri"/>
+          <w:sz w:val="22"/>
+          <w:szCs w:val="22"/>
+        </w:rPr>
+        <w:t xml:space="preserve">A SCAN from a 169.254 address says it only swept one /24 of the /16 — use DISCOVER or the DHCP tab's ◇ SITTING list for link-local devices.</w:t>
+      </w:r>
+    </w:p>
+    <w:p>
+      <w:pPr>
+        <w:pStyle w:val="Heading2"/>
+        <w:spacing w:after="100" w:before="240"/>
+      </w:pPr>
+      <w:r>
+        <w:rPr>
+          <w:rFonts w:ascii="Calibri" w:cs="Calibri" w:eastAsia="Calibri" w:hAnsi="Calibri"/>
+          <w:b/>
+          <w:bCs/>
+          <w:color w:val="222222"/>
+          <w:sz w:val="26"/>
+          <w:szCs w:val="26"/>
+        </w:rPr>
         <w:t xml:space="preserve">Presets</w:t>
       </w:r>
     </w:p>
@@ -1855,7 +1977,7 @@
           <w:sz w:val="22"/>
           <w:szCs w:val="22"/>
         </w:rPr>
-        <w:t xml:space="preserve">A DHCP server for the bench and the dead segment: a box of new cameras on a switch with no router, a site whose DHCP has died, a device that will not take a static address until it has had a lease. It hears everything and answers nothing until you say so.</w:t>
+        <w:t xml:space="preserve">A DHCP server for the bench and the dead segment: a box of new cameras on a switch with no router, a site whose DHCP has died, a device that will not take a static address until it has had a lease. The laptop is the server. It hears everything and answers nothing until you say so.</w:t>
       </w:r>
     </w:p>
     <w:p>
@@ -1872,7 +1994,7 @@
           <w:sz w:val="26"/>
           <w:szCs w:val="26"/>
         </w:rPr>
-        <w:t xml:space="preserve">How it behaves</w:t>
+        <w:t xml:space="preserve">Two steps at the top</w:t>
       </w:r>
     </w:p>
     <w:p>
@@ -1892,15 +2014,15 @@
           <w:sz w:val="22"/>
           <w:szCs w:val="22"/>
         </w:rPr>
-        <w:t xml:space="preserve">Off at launch.</w:t>
-      </w:r>
-      <w:r>
-        <w:rPr>
-          <w:rFonts w:ascii="Calibri" w:cs="Calibri" w:eastAsia="Calibri" w:hAnsi="Calibri"/>
-          <w:sz w:val="22"/>
-          <w:szCs w:val="22"/>
-        </w:rPr>
-        <w:t xml:space="preserve"> Nothing listens on the DHCP port until you open the tab. Opening it starts LISTEN: every device asking for an address appears in the table as ASKING, with the address it would be given.</w:t>
+        <w:t xml:space="preserve">① NETWORK CARD</w:t>
+      </w:r>
+      <w:r>
+        <w:rPr>
+          <w:rFonts w:ascii="Calibri" w:cs="Calibri" w:eastAsia="Calibri" w:hAnsi="Calibri"/>
+          <w:sz w:val="22"/>
+          <w:szCs w:val="22"/>
+        </w:rPr>
+        <w:t xml:space="preserve"> — the cable you're plugged into. The line under it says what the card is, its link speed, and whether it has an address. It follows the IP tab's adapter unless you pick another.</w:t>
       </w:r>
     </w:p>
     <w:p>
@@ -1920,15 +2042,33 @@
           <w:sz w:val="22"/>
           <w:szCs w:val="22"/>
         </w:rPr>
-        <w:t xml:space="preserve">Serving is opt-in, per device.</w:t>
-      </w:r>
-      <w:r>
-        <w:rPr>
-          <w:rFonts w:ascii="Calibri" w:cs="Calibri" w:eastAsia="Calibri" w:hAnsi="Calibri"/>
-          <w:sz w:val="22"/>
-          <w:szCs w:val="22"/>
-        </w:rPr>
-        <w:t xml:space="preserve"> SERVE on a row answers only that device. Tick several rows and press SERVE SELECTED to answer just those. This is the right choice on a customer network that has DHCP of its own.</w:t>
+        <w:t xml:space="preserve">② LAPTOP'S ADDRESS ON THAT CABLE</w:t>
+      </w:r>
+      <w:r>
+        <w:rPr>
+          <w:rFonts w:ascii="Calibri" w:cs="Calibri" w:eastAsia="Calibri" w:hAnsi="Calibri"/>
+          <w:sz w:val="22"/>
+          <w:szCs w:val="22"/>
+        </w:rPr>
+        <w:t xml:space="preserve"> — the address the laptop answers DHCP from. Devices get addresses next to it, and it is how you reach them afterwards. Each address on the card is a chip; the selected one is filled in. No address? SET LAPTOP IP… gives the card one (192.168.0.1 by default — the factory subnet most of our gear expects — duplicate-checked on the wire, moved to the next if taken, reverted when you quit). + ALIAS adds a second, temporary address to hand out on another subnet while the laptop keeps its own.</w:t>
+      </w:r>
+    </w:p>
+    <w:p>
+      <w:pPr>
+        <w:pStyle w:val="ListParagraph"/>
+        <w:numPr>
+          <w:ilvl w:val="0"/>
+          <w:numId w:val="2"/>
+        </w:numPr>
+        <w:spacing w:after="80" w:line="276"/>
+      </w:pPr>
+      <w:r>
+        <w:rPr>
+          <w:rFonts w:ascii="Calibri" w:cs="Calibri" w:eastAsia="Calibri" w:hAnsi="Calibri"/>
+          <w:sz w:val="22"/>
+          <w:szCs w:val="22"/>
+        </w:rPr>
+        <w:t xml:space="preserve">A strip under the chips reads it back: LAPTOP 192.168.0.1 ── Ethernet 2 ── DEVICES GET 192.168.0.100 – .200.</w:t>
       </w:r>
     </w:p>
     <w:p>
@@ -1948,15 +2088,176 @@
           <w:sz w:val="22"/>
           <w:szCs w:val="22"/>
         </w:rPr>
-        <w:t xml:space="preserve">SERVE ALL DEVICES</w:t>
-      </w:r>
-      <w:r>
-        <w:rPr>
-          <w:rFonts w:ascii="Calibri" w:cs="Calibri" w:eastAsia="Calibri" w:hAnsi="Calibri"/>
-          <w:sz w:val="22"/>
-          <w:szCs w:val="22"/>
-        </w:rPr>
-        <w:t xml:space="preserve"> answers everyone. It first scans the wire for other DHCP servers and stops to ask if it finds one — or if one was heard in the last two minutes, even if it didn't answer this time. It also warns when the laptop is connected to another network at the same time (Wi-Fi, usually), because serving everyone would answer that side too.</w:t>
+        <w:t xml:space="preserve">Settings from another job.</w:t>
+      </w:r>
+      <w:r>
+        <w:rPr>
+          <w:rFonts w:ascii="Calibri" w:cs="Calibri" w:eastAsia="Calibri" w:hAnsi="Calibri"/>
+          <w:sz w:val="22"/>
+          <w:szCs w:val="22"/>
+        </w:rPr>
+        <w:t xml:space="preserve"> The tab remembers its last settings. If the saved laptop IP is not an address on the card any more (yesterday's site), it refills from the card when you open it and says so. A loaded profile that doesn't match gets REFILL FROM CARD / + ADD AS ALIAS, and nothing is ever served from an address the card doesn't have.</w:t>
+      </w:r>
+    </w:p>
+    <w:p>
+      <w:pPr>
+        <w:pStyle w:val="Heading2"/>
+        <w:spacing w:after="100" w:before="240"/>
+      </w:pPr>
+      <w:r>
+        <w:rPr>
+          <w:rFonts w:ascii="Calibri" w:cs="Calibri" w:eastAsia="Calibri" w:hAnsi="Calibri"/>
+          <w:b/>
+          <w:bCs/>
+          <w:color w:val="222222"/>
+          <w:sz w:val="26"/>
+          <w:szCs w:val="26"/>
+        </w:rPr>
+        <w:t xml:space="preserve">The everyday flow — one device</w:t>
+      </w:r>
+    </w:p>
+    <w:p>
+      <w:pPr>
+        <w:spacing w:after="120" w:line="276"/>
+      </w:pPr>
+      <w:r>
+        <w:rPr>
+          <w:rFonts w:ascii="Calibri" w:cs="Calibri" w:eastAsia="Calibri" w:hAnsi="Calibri"/>
+          <w:sz w:val="22"/>
+          <w:szCs w:val="22"/>
+        </w:rPr>
+        <w:t xml:space="preserve">Plug the device in. It appears ASKING, with what it says it is under DEVICE — Axis puts the model and firmware in its DHCP request, so an A1210 reads "AXIS A1210 12.2.63" before it has an address. The IP box on its row is the address it will get: type the one it should end up on, press ▶ SERVE, then ↗ OPEN on the row. Set it static on the device on that same address and stop — when it stops renewing (or releases its lease) but still answers there, the row turns ✓ STATIC and the lease is freed. The next device that asks starts one address higher, so a run of cameras off one PoE injector is SERVE, OPEN, next row. Only the devices you serve are answered; on a customer network their DHCP is untouched.</w:t>
+      </w:r>
+    </w:p>
+    <w:p>
+      <w:pPr>
+        <w:pStyle w:val="Heading2"/>
+        <w:spacing w:after="100" w:before="240"/>
+      </w:pPr>
+      <w:r>
+        <w:rPr>
+          <w:rFonts w:ascii="Calibri" w:cs="Calibri" w:eastAsia="Calibri" w:hAnsi="Calibri"/>
+          <w:b/>
+          <w:bCs/>
+          <w:color w:val="222222"/>
+          <w:sz w:val="26"/>
+          <w:szCs w:val="26"/>
+        </w:rPr>
+        <w:t xml:space="preserve">◇ SITTING — heard, not asking</w:t>
+      </w:r>
+    </w:p>
+    <w:p>
+      <w:pPr>
+        <w:spacing w:after="120" w:line="276"/>
+      </w:pPr>
+      <w:r>
+        <w:rPr>
+          <w:rFonts w:ascii="Calibri" w:cs="Calibri" w:eastAsia="Calibri" w:hAnsi="Calibri"/>
+          <w:sz w:val="22"/>
+          <w:szCs w:val="22"/>
+        </w:rPr>
+        <w:t xml:space="preserve">While the tab listens it also hears what devices announce to the whole wire — mDNS, SSDP, and (with Wireshark installed) ARP and device LLDP — whatever subnet they are on. That is how AXIS IP Utility finds things. A device that isn't asking for DHCP shows as ◇ SITTING with its address, name and model. ↗ OPEN if it's on the laptop's subnet; otherwise ⇢ REACH gives the laptop a temporary address next to it (on its /24, or 169.254/16) and opens it.</w:t>
+      </w:r>
+    </w:p>
+    <w:p>
+      <w:pPr>
+        <w:pStyle w:val="Heading2"/>
+        <w:spacing w:after="100" w:before="240"/>
+      </w:pPr>
+      <w:r>
+        <w:rPr>
+          <w:rFonts w:ascii="Calibri" w:cs="Calibri" w:eastAsia="Calibri" w:hAnsi="Calibri"/>
+          <w:b/>
+          <w:bCs/>
+          <w:color w:val="222222"/>
+          <w:sz w:val="26"/>
+          <w:szCs w:val="26"/>
+        </w:rPr>
+        <w:t xml:space="preserve">How it behaves</w:t>
+      </w:r>
+    </w:p>
+    <w:p>
+      <w:pPr>
+        <w:pStyle w:val="ListParagraph"/>
+        <w:numPr>
+          <w:ilvl w:val="0"/>
+          <w:numId w:val="2"/>
+        </w:numPr>
+        <w:spacing w:after="80" w:line="276"/>
+      </w:pPr>
+      <w:r>
+        <w:rPr>
+          <w:rFonts w:ascii="Calibri" w:cs="Calibri" w:eastAsia="Calibri" w:hAnsi="Calibri"/>
+          <w:b/>
+          <w:bCs/>
+          <w:sz w:val="22"/>
+          <w:szCs w:val="22"/>
+        </w:rPr>
+        <w:t xml:space="preserve">Off at launch.</w:t>
+      </w:r>
+      <w:r>
+        <w:rPr>
+          <w:rFonts w:ascii="Calibri" w:cs="Calibri" w:eastAsia="Calibri" w:hAnsi="Calibri"/>
+          <w:sz w:val="22"/>
+          <w:szCs w:val="22"/>
+        </w:rPr>
+        <w:t xml:space="preserve"> Nothing listens on the DHCP port until you open the tab. Opening it starts LISTEN: every device asking for an address appears in the table as ASKING, with the address it would be given.</w:t>
+      </w:r>
+    </w:p>
+    <w:p>
+      <w:pPr>
+        <w:pStyle w:val="ListParagraph"/>
+        <w:numPr>
+          <w:ilvl w:val="0"/>
+          <w:numId w:val="2"/>
+        </w:numPr>
+        <w:spacing w:after="80" w:line="276"/>
+      </w:pPr>
+      <w:r>
+        <w:rPr>
+          <w:rFonts w:ascii="Calibri" w:cs="Calibri" w:eastAsia="Calibri" w:hAnsi="Calibri"/>
+          <w:b/>
+          <w:bCs/>
+          <w:sz w:val="22"/>
+          <w:szCs w:val="22"/>
+        </w:rPr>
+        <w:t xml:space="preserve">Serving is opt-in, per device.</w:t>
+      </w:r>
+      <w:r>
+        <w:rPr>
+          <w:rFonts w:ascii="Calibri" w:cs="Calibri" w:eastAsia="Calibri" w:hAnsi="Calibri"/>
+          <w:sz w:val="22"/>
+          <w:szCs w:val="22"/>
+        </w:rPr>
+        <w:t xml:space="preserve"> SERVE on a row answers only that device. Tick several rows and press SERVE TICKED to answer just those. This is the right choice on a customer network that has DHCP of its own.</w:t>
+      </w:r>
+    </w:p>
+    <w:p>
+      <w:pPr>
+        <w:pStyle w:val="ListParagraph"/>
+        <w:numPr>
+          <w:ilvl w:val="0"/>
+          <w:numId w:val="2"/>
+        </w:numPr>
+        <w:spacing w:after="80" w:line="276"/>
+      </w:pPr>
+      <w:r>
+        <w:rPr>
+          <w:rFonts w:ascii="Calibri" w:cs="Calibri" w:eastAsia="Calibri" w:hAnsi="Calibri"/>
+          <w:b/>
+          <w:bCs/>
+          <w:sz w:val="22"/>
+          <w:szCs w:val="22"/>
+        </w:rPr>
+        <w:t xml:space="preserve">SERVE EVERYONE…</w:t>
+      </w:r>
+      <w:r>
+        <w:rPr>
+          <w:rFonts w:ascii="Calibri" w:cs="Calibri" w:eastAsia="Calibri" w:hAnsi="Calibri"/>
+          <w:sz w:val="22"/>
+          <w:szCs w:val="22"/>
+        </w:rPr>
+        <w:t xml:space="preserve"> (the small amber button) answers everyone. It asks first, then scans the wire for other DHCP servers and stops to ask if it finds one — or if one was heard in the last two minutes, even if it didn't answer this time. It also warns when the laptop is connected to another network at the same time (Wi-Fi, usually), because serving everyone would answer that side too.</w:t>
       </w:r>
     </w:p>
     <w:p>
@@ -2028,7 +2329,7 @@
           <w:sz w:val="22"/>
           <w:szCs w:val="22"/>
         </w:rPr>
-        <w:t xml:space="preserve">Serving stops on its own after 30 minutes with nothing to do (ADVANCED OPTIONS changes or disables this). The mode badge — OFFLINE / LISTENING / SERVING — is also the on-off switch; OFFLINE releases the port and removes the firewall rule. The same red / green / amber dot sits on the DHCP tab itself, so the engine's state is visible from every tab. While RECON's SILENT listen has the adapter the engine shows SUSPENDED and resumes by itself.</w:t>
+        <w:t xml:space="preserve">Serving stops on its own after 30 minutes with nothing to do (ADVANCED OPTIONS changes or disables this). The status chip — OFF / LISTENING / SERVING N / SERVING EVERYONE — is also the on-off switch; OFF releases the port and removes the firewall rule. The same red / green / amber dot sits on the DHCP tab itself, so the engine's state is visible from every tab. While RECON's SILENT listen has the adapter the engine shows SUSPENDED and resumes by itself.</w:t>
       </w:r>
     </w:p>
     <w:p>
@@ -2149,7 +2450,7 @@
                 <w:sz w:val="20"/>
                 <w:szCs w:val="20"/>
               </w:rPr>
-              <w:t xml:space="preserve">SERVE ON</w:t>
+              <w:t xml:space="preserve">① CARD · ② LAPTOP IP</w:t>
             </w:r>
           </w:p>
         </w:tc>
@@ -2175,7 +2476,7 @@
                 <w:sz w:val="20"/>
                 <w:szCs w:val="20"/>
               </w:rPr>
-              <w:t xml:space="preserve">Which adapter to serve on. Follows the ETHER tab's adapter unless you pick another. LINK UP / NO LINK beside it is live. An adapter that also carries a Multi-IP asks which address to serve from — pick the alias to hand out leases on the camera subnet while the laptop keeps its own; ⟳ asks again.</w:t>
+              <w:t xml:space="preserve">Which cable, and the laptop's address on it (chips). SET LAPTOP IP… and + ALIAS add an address — both temporary, reverted when you quit and recovered on the next launch after a force-close.</w:t>
             </w:r>
           </w:p>
         </w:tc>
@@ -2206,7 +2507,7 @@
                 <w:sz w:val="20"/>
                 <w:szCs w:val="20"/>
               </w:rPr>
-              <w:t xml:space="preserve">DHCP SETTINGS</w:t>
+              <w:t xml:space="preserve">ADDRESSES TO HAND OUT</w:t>
             </w:r>
           </w:p>
         </w:tc>
@@ -2232,7 +2533,7 @@
                 <w:sz w:val="20"/>
                 <w:szCs w:val="20"/>
               </w:rPr>
-              <w:t xml:space="preserve">Server IP (this PC), mask, pool start and end, gateway (blank = this PC), lease length. Filled in from the adapter when you pick it. ADVANCED adds DNS, domain, NTP, TFTP, boot file, vendor option 43 and the idle timer.</w:t>
+              <w:t xml:space="preserve">First, last, mask, gateway (blank = laptop) and lease (1 min … 1 day, default 5 min). Filled in from the laptop address you pick. ADVANCED adds DNS, domain, NTP, TFTP, boot file, vendor option 43 and the idle timer.</w:t>
             </w:r>
           </w:p>
         </w:tc>
@@ -2289,7 +2590,7 @@
                 <w:sz w:val="20"/>
                 <w:szCs w:val="20"/>
               </w:rPr>
-              <w:t xml:space="preserve">Save the settings under a name and load them on the next job.</w:t>
+              <w:t xml:space="preserve">Save the settings under a name and load them on the next job — checked against the card when loaded.</w:t>
             </w:r>
           </w:p>
         </w:tc>
@@ -2320,7 +2621,7 @@
                 <w:sz w:val="20"/>
                 <w:szCs w:val="20"/>
               </w:rPr>
-              <w:t xml:space="preserve">QUICK START</w:t>
+              <w:t xml:space="preserve">SERVE EVERYONE…</w:t>
             </w:r>
           </w:p>
         </w:tc>
@@ -2346,7 +2647,7 @@
                 <w:sz w:val="20"/>
                 <w:szCs w:val="20"/>
               </w:rPr>
-              <w:t xml:space="preserve">Picks the wired adapter, fills the pool from its subnet, scans the wire, serves. If the adapter has no usable address it offers to set a temporary static one through the ETHER apply path — reverted when you quit, and recovered on the next launch if the app was force-closed.</w:t>
+              <w:t xml:space="preserve">Answer every device on the cable. Asks first, scans the wire, warns about another live server or a second network.</w:t>
             </w:r>
           </w:p>
         </w:tc>
@@ -2517,7 +2818,7 @@
                 <w:sz w:val="20"/>
                 <w:szCs w:val="20"/>
               </w:rPr>
-              <w:t xml:space="preserve">Status, address, MAC, vendor, hostname, activity. SERVE, OPEN (web UI), ★ pin, ✕ take the address back. Randomised MACs (phones with privacy on) are labelled as such. Tick several rows and ★ RESERVE SELECTED gives them consecutive fixed addresses from a start you type — twenty cameras in one go; the server, gateway and existing reservations are skipped.</w:t>
+              <w:t xml:space="preserve">Status (ASKING · SERVED · ✓ STATIC · ◇ SITTING), address, MAC, device (model / vendor), hostname, activity. ▶ SERVE with the typed address, ↗ OPEN (web UI), ⇢ REACH, ★ pin, ✕ take the address back. Tick several rows and ★ RESERVE TICKED gives them consecutive fixed addresses from a start you type — twenty cameras in one go; the server, gateway and existing reservations are skipped.</w:t>
             </w:r>
           </w:p>
         </w:tc>
@@ -3894,7 +4195,7 @@
                 <w:sz w:val="20"/>
                 <w:szCs w:val="20"/>
               </w:rPr>
-              <w:t xml:space="preserve">A free-looking address on the busiest subnet, with the mask and gateway heard. TAKE puts it into the ETHER form; APPLY still runs the duplicate check.</w:t>
+              <w:t xml:space="preserve">A free-looking address on the busiest subnet, with the mask and gateway heard. TAKE puts it into the IP tab form; APPLY still runs the duplicate check.</w:t>
             </w:r>
           </w:p>
         </w:tc>
@@ -4079,7 +4380,7 @@
           <w:sz w:val="22"/>
           <w:szCs w:val="22"/>
         </w:rPr>
-        <w:t xml:space="preserve">TOOLS — MTU → 1500 for the adapter selected in ETHER.</w:t>
+        <w:t xml:space="preserve">TOOLS — MTU → 1500 for the adapter selected on the IP tab.</w:t>
       </w:r>
     </w:p>
     <w:p>
@@ -4098,6 +4399,34 @@
           <w:szCs w:val="22"/>
         </w:rPr>
         <w:t xml:space="preserve">STATE — version, whether the app is elevated, your user and machine, where the data lives, Wireshark and tshark, credential storage status, the DHCP engine's state, and any policy in effect.</w:t>
+      </w:r>
+    </w:p>
+    <w:p>
+      <w:pPr>
+        <w:pStyle w:val="ListParagraph"/>
+        <w:numPr>
+          <w:ilvl w:val="0"/>
+          <w:numId w:val="2"/>
+        </w:numPr>
+        <w:spacing w:after="80" w:line="276"/>
+      </w:pPr>
+      <w:r>
+        <w:rPr>
+          <w:rFonts w:ascii="Calibri" w:cs="Calibri" w:eastAsia="Calibri" w:hAnsi="Calibri"/>
+          <w:b/>
+          <w:bCs/>
+          <w:sz w:val="22"/>
+          <w:szCs w:val="22"/>
+        </w:rPr>
+        <w:t xml:space="preserve">PROCESS LAUNCH</w:t>
+      </w:r>
+      <w:r>
+        <w:rPr>
+          <w:rFonts w:ascii="Calibri" w:cs="Calibri" w:eastAsia="Calibri" w:hAnsi="Calibri"/>
+          <w:sz w:val="22"/>
+          <w:szCs w:val="22"/>
+        </w:rPr>
+        <w:t xml:space="preserve"> — how long one bare process launch (cmd /c ver) takes on this laptop, timed at start-up, with a verdict, plus how many launches the app has made and the slowest. Endpoint security inspects every launch; on a healthy box it is tens of milliseconds, on a managed laptop a few hundred, and over a second means every action that runs a command will lag — the first number to read on an "it's slow" report. PS WORKER shows the one PowerShell the app keeps open for its read-only queries.</w:t>
       </w:r>
     </w:p>
     <w:p>
@@ -4198,7 +4527,7 @@
           <w:sz w:val="22"/>
           <w:szCs w:val="22"/>
         </w:rPr>
-        <w:t xml:space="preserve">Plug in. ETHER shows the adapter, its link speed and its current state in LIVE. Not sure what the port is? RECON → LISTEN: in a minute you know the switch and port you are on, whether it wants 802.1X, which VLAN, who hands out addresses, and a free address you could take. Then pick a preset or a Factory Default, APPLY, and the status line, the IP field and the top bar all confirm the change. If the device you need is on a second subnet, add a Multi-IP instead of changing your primary.</w:t>
+        <w:t xml:space="preserve">Plug in. The IP tab shows the adapter, its link speed and its current state in LIVE. Not sure what the port is? RECON → LISTEN: in a minute you know the switch and port you are on, whether it wants 802.1X, which VLAN, who hands out addresses, and a free address you could take. Then pick a preset or a Factory Default, APPLY, and the status line, the IP field and the top bar all confirm the change. If the device you need is on a second subnet, add a Multi-IP instead of changing your primary.</w:t>
       </w:r>
     </w:p>
     <w:p>
@@ -4228,7 +4557,7 @@
           <w:sz w:val="22"/>
           <w:szCs w:val="22"/>
         </w:rPr>
-        <w:t xml:space="preserve">DHCP tab. QUICK START picks the adapter, sets the pool, checks the wire and starts serving; if the laptop has no address it offers to set one. Cameras appear as they ask, get addresses, and OPEN takes you to each web UI. Quit when done — the laptop's adapter goes back the way it was.</w:t>
+        <w:t xml:space="preserve">DHCP tab. ① pick the card; ② SET LAPTOP IP… if it has no address (192.168.0.1). Cameras appear as they ask: type the address each should end up on, ▶ SERVE, ↗ OPEN, set it static, next row. SERVE EVERYONE… if you just want them all to have an address. Quit when done — the laptop's adapter goes back the way it was.</w:t>
       </w:r>
     </w:p>
     <w:p>
@@ -4288,7 +4617,7 @@
           <w:sz w:val="22"/>
           <w:szCs w:val="22"/>
         </w:rPr>
-        <w:t xml:space="preserve">SCAN → DISCOVER. The camera shows up on its 169.254 address with an ONVIF badge even though your laptop is on 192.168. Press REACH: a link-local alias goes on your adapter and the camera's web page opens. Give it its real address, then REMOVE on the chip (or just quit).</w:t>
+        <w:t xml:space="preserve">DHCP tab: a camera on its fallback address shows as ◇ SITTING with its model, even though your laptop is on another subnet. ⇢ REACH gives the laptop a temporary address next to it and opens its web page. (SCAN → DISCOVER and REACH do the same from the SCAN tab.) Give it its real address, then REMOVE on the chip (or just quit).</w:t>
       </w:r>
     </w:p>
     <w:p>
@@ -4896,6 +5225,21 @@
   <w:style w:type="paragraph" w:styleId="Normal" w:default="1">
     <w:name w:val="Normal"/>
     <w:qFormat/>
+  </w:style>
+  <w:style w:type="table" w:styleId="TableNormal" w:default="true">
+    <w:name w:val="Normal Table"/>
+    <w:uiPriority w:val="99"/>
+    <w:semiHidden/>
+    <w:unhideWhenUsed/>
+    <w:tblPr>
+      <w:tblInd w:type="dxa" w:w="0"/>
+      <w:tblCellMar>
+        <w:top w:type="dxa" w:w="0"/>
+        <w:left w:type="dxa" w:w="108"/>
+        <w:bottom w:type="dxa" w:w="0"/>
+        <w:right w:type="dxa" w:w="108"/>
+      </w:tblCellMar>
+    </w:tblPr>
   </w:style>
   <w:style w:type="paragraph" w:styleId="Title">
     <w:name w:val="Title"/>
@@ -4984,6 +5328,139 @@
     <w:basedOn w:val="Normal"/>
     <w:qFormat/>
   </w:style>
+  <w:style w:type="paragraph" w:styleId="Caption">
+    <w:name w:val="caption"/>
+    <w:basedOn w:val="Normal"/>
+    <w:next w:val="Normal"/>
+    <w:uiPriority w:val="35"/>
+    <w:semiHidden/>
+    <w:unhideWhenUsed/>
+    <w:qFormat/>
+    <w:pPr>
+      <w:spacing w:after="200"/>
+    </w:pPr>
+    <w:rPr>
+      <w:i/>
+      <w:iCs/>
+      <w:color w:val="44546A" w:themeColor="dark2"/>
+      <w:sz w:val="18"/>
+      <w:szCs w:val="18"/>
+    </w:rPr>
+  </w:style>
+  <w:style w:type="paragraph" w:styleId="Bibliography">
+    <w:name w:val="Bibliography"/>
+    <w:basedOn w:val="Normal"/>
+    <w:next w:val="Normal"/>
+    <w:uiPriority w:val="37"/>
+    <w:unhideWhenUsed/>
+  </w:style>
+  <w:style w:type="paragraph" w:styleId="TOC1">
+    <w:name w:val="toc 1"/>
+    <w:basedOn w:val="Normal"/>
+    <w:next w:val="Normal"/>
+    <w:uiPriority w:val="39"/>
+    <w:semiHidden/>
+    <w:unhideWhenUsed/>
+    <w:pPr>
+      <w:spacing w:after="100"/>
+    </w:pPr>
+  </w:style>
+  <w:style w:type="paragraph" w:styleId="TOC2">
+    <w:name w:val="toc 2"/>
+    <w:basedOn w:val="Normal"/>
+    <w:next w:val="Normal"/>
+    <w:uiPriority w:val="39"/>
+    <w:semiHidden/>
+    <w:unhideWhenUsed/>
+    <w:pPr>
+      <w:spacing w:after="100"/>
+      <w:ind w:left="220"/>
+    </w:pPr>
+  </w:style>
+  <w:style w:type="paragraph" w:styleId="TOC3">
+    <w:name w:val="toc 3"/>
+    <w:basedOn w:val="Normal"/>
+    <w:next w:val="Normal"/>
+    <w:uiPriority w:val="39"/>
+    <w:semiHidden/>
+    <w:unhideWhenUsed/>
+    <w:pPr>
+      <w:spacing w:after="100"/>
+      <w:ind w:left="440"/>
+    </w:pPr>
+  </w:style>
+  <w:style w:type="paragraph" w:styleId="TOC4">
+    <w:name w:val="toc 4"/>
+    <w:basedOn w:val="Normal"/>
+    <w:next w:val="Normal"/>
+    <w:uiPriority w:val="39"/>
+    <w:semiHidden/>
+    <w:unhideWhenUsed/>
+    <w:pPr>
+      <w:spacing w:after="100"/>
+      <w:ind w:left="660"/>
+    </w:pPr>
+  </w:style>
+  <w:style w:type="paragraph" w:styleId="TOC5">
+    <w:name w:val="toc 5"/>
+    <w:basedOn w:val="Normal"/>
+    <w:next w:val="Normal"/>
+    <w:uiPriority w:val="39"/>
+    <w:semiHidden/>
+    <w:unhideWhenUsed/>
+    <w:pPr>
+      <w:spacing w:after="100"/>
+      <w:ind w:left="880"/>
+    </w:pPr>
+  </w:style>
+  <w:style w:type="paragraph" w:styleId="TOC6">
+    <w:name w:val="toc 6"/>
+    <w:basedOn w:val="Normal"/>
+    <w:next w:val="Normal"/>
+    <w:uiPriority w:val="39"/>
+    <w:semiHidden/>
+    <w:unhideWhenUsed/>
+    <w:pPr>
+      <w:spacing w:after="100"/>
+      <w:ind w:left="1100"/>
+    </w:pPr>
+  </w:style>
+  <w:style w:type="paragraph" w:styleId="TOC7">
+    <w:name w:val="toc 7"/>
+    <w:basedOn w:val="Normal"/>
+    <w:next w:val="Normal"/>
+    <w:uiPriority w:val="39"/>
+    <w:semiHidden/>
+    <w:unhideWhenUsed/>
+    <w:pPr>
+      <w:spacing w:after="100"/>
+      <w:ind w:left="1320"/>
+    </w:pPr>
+  </w:style>
+  <w:style w:type="paragraph" w:styleId="TOC8">
+    <w:name w:val="toc 8"/>
+    <w:basedOn w:val="Normal"/>
+    <w:next w:val="Normal"/>
+    <w:uiPriority w:val="39"/>
+    <w:semiHidden/>
+    <w:unhideWhenUsed/>
+    <w:pPr>
+      <w:spacing w:after="100"/>
+      <w:ind w:left="1540"/>
+    </w:pPr>
+  </w:style>
+  <w:style w:type="paragraph" w:styleId="TOC9">
+    <w:name w:val="toc 9"/>
+    <w:basedOn w:val="Normal"/>
+    <w:next w:val="Normal"/>
+    <w:uiPriority w:val="39"/>
+    <w:semiHidden/>
+    <w:unhideWhenUsed/>
+    <w:pPr>
+      <w:spacing w:after="100"/>
+      <w:ind w:left="1760"/>
+    </w:pPr>
+  </w:style>
   <w:style w:type="character" w:styleId="Hyperlink">
     <w:name w:val="Hyperlink"/>
     <w:basedOn w:val="DefaultParagraphFont"/>
@@ -5067,6 +5544,13 @@
       <w:sz w:val="20"/>
       <w:szCs w:val="20"/>
     </w:rPr>
+  </w:style>
+  <w:style w:type="character" w:styleId="LineNumber">
+    <w:name w:val="line number"/>
+    <w:basedOn w:val="DefaultParagraphFont"/>
+    <w:uiPriority w:val="99"/>
+    <w:semiHidden/>
+    <w:unhideWhenUsed/>
   </w:style>
 </w:styles>
 </file>

</xml_diff>

<commit_message>
v7.2.1: DHCP replies and SCAN WIRE go out the serving card (subnet broadcast), not the default-route card
</commit_message>
<xml_diff>
--- a/assets/NET-ETHER-Guide.docx
+++ b/assets/NET-ETHER-Guide.docx
@@ -57,7 +57,7 @@
           <w:sz w:val="22"/>
           <w:szCs w:val="22"/>
         </w:rPr>
-        <w:t xml:space="preserve">Application version 7.2.0 · Document version 5.1</w:t>
+        <w:t xml:space="preserve">Application version 7.2.1 · Document version 5.2</w:t>
       </w:r>
     </w:p>
     <w:p>
@@ -2257,7 +2257,7 @@
           <w:sz w:val="22"/>
           <w:szCs w:val="22"/>
         </w:rPr>
-        <w:t xml:space="preserve"> (the small amber button) answers everyone. It asks first, then scans the wire for other DHCP servers and stops to ask if it finds one — or if one was heard in the last two minutes, even if it didn't answer this time. It also warns when the laptop is connected to another network at the same time (Wi-Fi, usually), because serving everyone would answer that side too.</w:t>
+        <w:t xml:space="preserve"> (the small amber button) answers everyone. It asks first, then scans the wire for other DHCP servers and stops to ask if it finds one — or if one was heard in the last two minutes, even if it didn't answer this time. It also warns when the laptop is connected to another network at the same time (Wi-Fi, usually): requests from that side show up in the list too. The answers themselves always go out the card you picked in step ①, Wi-Fi or not.</w:t>
       </w:r>
     </w:p>
     <w:p>

</xml_diff>

<commit_message>
v7.2.2: OPEN and REACH pick http or https (AXIS OS 12 is https-only)
</commit_message>
<xml_diff>
--- a/assets/NET-ETHER-Guide.docx
+++ b/assets/NET-ETHER-Guide.docx
@@ -57,7 +57,7 @@
           <w:sz w:val="22"/>
           <w:szCs w:val="22"/>
         </w:rPr>
-        <w:t xml:space="preserve">Application version 7.2.1 · Document version 5.2</w:t>
+        <w:t xml:space="preserve">Application version 7.2.2 · Document version 5.3</w:t>
       </w:r>
     </w:p>
     <w:p>
@@ -2818,7 +2818,7 @@
                 <w:sz w:val="20"/>
                 <w:szCs w:val="20"/>
               </w:rPr>
-              <w:t xml:space="preserve">Status (ASKING · SERVED · ✓ STATIC · ◇ SITTING), address, MAC, device (model / vendor), hostname, activity. ▶ SERVE with the typed address, ↗ OPEN (web UI), ⇢ REACH, ★ pin, ✕ take the address back. Tick several rows and ★ RESERVE TICKED gives them consecutive fixed addresses from a start you type — twenty cameras in one go; the server, gateway and existing reservations are skipped.</w:t>
+              <w:t xml:space="preserve">Status (ASKING · SERVED · ✓ STATIC · ◇ SITTING), address, MAC, device (model / vendor), hostname, activity. ▶ SERVE with the typed address, ↗ OPEN (web UI — http or https, whichever the device answers; a certificate warning on a brand-new device is normal), ⇢ REACH, ★ pin, ✕ take the address back. Tick several rows and ★ RESERVE TICKED gives them consecutive fixed addresses from a start you type — twenty cameras in one go; the server, gateway and existing reservations are skipped.</w:t>
             </w:r>
           </w:p>
         </w:tc>

</xml_diff>

<commit_message>
User Guide 6.0 for 7.3.0 (docx + PDF)
Co-Authored-By: Claude Opus 5.5 <noreply@anthropic.com>
Claude-Session: https://claude.ai/code/session_01KPgYwk8yW4V2JUw7D5jVqS
</commit_message>
<xml_diff>
--- a/assets/NET-ETHER-Guide.docx
+++ b/assets/NET-ETHER-Guide.docx
@@ -57,7 +57,7 @@
           <w:sz w:val="22"/>
           <w:szCs w:val="22"/>
         </w:rPr>
-        <w:t xml:space="preserve">Application version 7.2.2 · Document version 5.3</w:t>
+        <w:t xml:space="preserve">Application version 7.3.0 · Document version 6.0</w:t>
       </w:r>
     </w:p>
     <w:p>
@@ -133,7 +133,7 @@
           <w:sz w:val="22"/>
           <w:szCs w:val="22"/>
         </w:rPr>
-        <w:t xml:space="preserve">Version 7 absorbed NET//DHCP; 7.1 adds RECON, multicast discovery, link speed, a Wi-Fi switch, port blinking, Wake-on-LAN and a site report. One application, one installer, signed.</w:t>
+        <w:t xml:space="preserve">Version 7 absorbed NET//DHCP; 7.1 adds RECON, multicast discovery, link speed, a Wi-Fi switch, port blinking, Wake-on-LAN and a site report. 7.2 rebuilt the DHCP tab around one device at a time and listens for devices the way AXIS IP Utility does. 7.3 is the stability release: no prompts on hide or quit, a one-line note for anything left on a card, sleep-aware, and honest about cards with no cable. One application, one installer, signed.</w:t>
       </w:r>
     </w:p>
     <w:p>
@@ -358,7 +358,7 @@
                 <w:sz w:val="20"/>
                 <w:szCs w:val="20"/>
               </w:rPr>
-              <w:t xml:space="preserve">Version chip (e.g. v7.1.0)</w:t>
+              <w:t xml:space="preserve">Version chip (e.g. v7.3.0)</w:t>
             </w:r>
           </w:p>
         </w:tc>
@@ -612,7 +612,7 @@
                 <w:sz w:val="20"/>
                 <w:szCs w:val="20"/>
               </w:rPr>
-              <w:t xml:space="preserve">Hide to the system tray. Click the tray icon to bring it back; double-click always shows it.</w:t>
+              <w:t xml:space="preserve">Minimize to the taskbar, like any app. Alt+Tab, the taskbar button or the tray icon bring it back.</w:t>
             </w:r>
           </w:p>
         </w:tc>
@@ -669,7 +669,7 @@
                 <w:sz w:val="20"/>
                 <w:szCs w:val="20"/>
               </w:rPr>
-              <w:t xml:space="preserve">Quit. If a Multi-IP is still on an adapter you're warned first (press ✕ again to quit anyway); if you changed any adapter this session you're offered a one-click restore. DHCP serving, temporary link-local aliases and RECON's adapter bindings are all put back before the app exits.</w:t>
+              <w:t xml:space="preserve">Quit, one click, no questions. What you set stays set (APPLY, MULTI-IP, + ALIAS, SET LAPTOP IP…). What the app did on its own is cleaned up before it exits: DHCP serving stops, temporary REACH addresses go, RECON's adapter bindings come back. Anything you left on a card is mentioned once on the next launch (see Leftovers in section 3).</w:t>
             </w:r>
           </w:p>
         </w:tc>
@@ -797,7 +797,20 @@
           <w:sz w:val="22"/>
           <w:szCs w:val="22"/>
         </w:rPr>
-        <w:t xml:space="preserve">The tray icon pulses green normally, amber when the HUD is dimmed, and flashes red while any PING host is failing — even with the HUD hidden. The tooltip shows the DHCP serving state.</w:t>
+        <w:t xml:space="preserve">The tray icon pulses green normally, dims with the HUD, and turns solid pulsing red while any PING host is failing. The taskbar button shows the same alert as a red ! badge and flashes once when it starts. The tray tooltip shows the DHCP serving state.</w:t>
+      </w:r>
+    </w:p>
+    <w:p>
+      <w:pPr>
+        <w:spacing w:after="120" w:line="276"/>
+      </w:pPr>
+      <w:r>
+        <w:rPr>
+          <w:rFonts w:ascii="Calibri" w:cs="Calibri" w:eastAsia="Calibri" w:hAnsi="Calibri"/>
+          <w:sz w:val="22"/>
+          <w:szCs w:val="22"/>
+        </w:rPr>
+        <w:t xml:space="preserve">Closing the lid pauses the DHCP server, the wire listener and any running PING, and starts exactly those again a few seconds after the laptop wakes. A laptop in a closed lid is only half asleep, and with those running in a bag it gets hot and runs flat. Locking the screen pauses nothing.</w:t>
       </w:r>
     </w:p>
     <w:p>
@@ -827,7 +840,7 @@
           <w:sz w:val="22"/>
           <w:szCs w:val="22"/>
         </w:rPr>
-        <w:t xml:space="preserve">Everything on this tab acts on the adapter chosen in the ADAPTER dropdown. Wireless, VPN and virtual adapters are filtered out; only wired Ethernet is listed. A connected adapter shows its negotiated link speed where it used to say CONNECTED — green for gigabit, amber for 100 Mb, red for 10 — because a gigabit port talking at 100 is a bad crimp, cable or switch port, and that is the first thing to know. Beside it, a DHCP or STATIC badge from the registry, shown whether or not the cable is in.</w:t>
+        <w:t xml:space="preserve">Everything on this tab acts on the adapter chosen in the ADAPTER dropdown. Wireless, VPN and virtual adapters are filtered out; only wired Ethernet is listed. A connected adapter shows its negotiated link speed where it used to say CONNECTED — green for gigabit, amber for 100 Mb, red for 10 — because a gigabit port talking at 100 is a bad crimp, cable or switch port, and that is the first thing to know. Beside it, a DHCP or STATIC badge, shown whether or not the cable is in.</w:t>
       </w:r>
     </w:p>
     <w:tbl>
@@ -1102,6 +1115,63 @@
                 <w:sz w:val="20"/>
                 <w:szCs w:val="20"/>
               </w:rPr>
+              <w:t xml:space="preserve">NO CABLE · 192.168.0.1 SAVED</w:t>
+            </w:r>
+          </w:p>
+        </w:tc>
+        <w:tc>
+          <w:tcPr>
+            <w:tcW w:type="dxa" w:w="7080"/>
+            <w:tcMar>
+              <w:top w:type="dxa" w:w="60"/>
+              <w:left w:type="dxa" w:w="100"/>
+              <w:bottom w:type="dxa" w:w="60"/>
+              <w:right w:type="dxa" w:w="100"/>
+            </w:tcMar>
+          </w:tcPr>
+          <w:p>
+            <w:pPr>
+              <w:spacing w:after="0" w:line="260"/>
+            </w:pPr>
+            <w:r>
+              <w:rPr>
+                <w:rFonts w:ascii="Calibri" w:cs="Calibri" w:eastAsia="Calibri" w:hAnsi="Calibri"/>
+                <w:b w:val="false"/>
+                <w:bCs w:val="false"/>
+                <w:sz w:val="20"/>
+                <w:szCs w:val="20"/>
+              </w:rPr>
+              <w:t xml:space="preserve">No link, and the card is set to a static address. Windows keeps the address and uses it the moment there is link. The top bar reads 192.168.0.1 · NO CABLE. An unplugged card on DHCP reads NO CABLE · DHCP.</w:t>
+            </w:r>
+          </w:p>
+        </w:tc>
+      </w:tr>
+      <w:tr>
+        <w:trPr>
+          <w:tblHeader w:val="off"/>
+        </w:trPr>
+        <w:tc>
+          <w:tcPr>
+            <w:tcW w:type="dxa" w:w="3000"/>
+            <w:tcMar>
+              <w:top w:type="dxa" w:w="60"/>
+              <w:left w:type="dxa" w:w="100"/>
+              <w:bottom w:type="dxa" w:w="60"/>
+              <w:right w:type="dxa" w:w="100"/>
+            </w:tcMar>
+          </w:tcPr>
+          <w:p>
+            <w:pPr>
+              <w:spacing w:after="0" w:line="260"/>
+            </w:pPr>
+            <w:r>
+              <w:rPr>
+                <w:rFonts w:ascii="Calibri" w:cs="Calibri" w:eastAsia="Calibri" w:hAnsi="Calibri"/>
+                <w:b w:val="false"/>
+                <w:bCs w:val="false"/>
+                <w:sz w:val="20"/>
+                <w:szCs w:val="20"/>
+              </w:rPr>
               <w:t xml:space="preserve">DISABLED</w:t>
             </w:r>
           </w:p>
@@ -1547,7 +1617,7 @@
                 <w:sz w:val="20"/>
                 <w:szCs w:val="20"/>
               </w:rPr>
-              <w:t xml:space="preserve">Writes IP, mask, gateway and DNS to the adapter, then re-reads it to confirm the change took. The button shows a moving sweep while netsh runs. A verified change lights the status bar green, tags the IP field ✓ ACTIVE and flashes the new address in the top bar. A failure turns the field red and shows netsh's own message.</w:t>
+              <w:t xml:space="preserve">Writes IP, mask, gateway and DNS to the adapter, then re-reads it to confirm the change took. The button shows a moving sweep while netsh runs. A verified change lights the status bar green, tags the IP field ✓ ACTIVE and flashes the new address in the top bar. On a card with no cable the field reads ✓ SAVED · NO CABLE: the address is set and comes up with the link. A failure turns the field red and shows netsh's own message.</w:t>
             </w:r>
           </w:p>
         </w:tc>
@@ -1604,7 +1674,7 @@
                 <w:sz w:val="20"/>
                 <w:szCs w:val="20"/>
               </w:rPr>
-              <w:t xml:space="preserve">Beside the STATIC badge in the adapter row. Click twice to hand the adapter back to DHCP. Switching to DHCP drops every Multi-IP on that adapter.</w:t>
+              <w:t xml:space="preserve">Beside the STATIC badge in the adapter row. One click hands the adapter back to DHCP, cable or no cable. Switching to DHCP drops every Multi-IP on that adapter.</w:t>
             </w:r>
           </w:p>
         </w:tc>
@@ -1718,7 +1788,7 @@
                 <w:sz w:val="20"/>
                 <w:szCs w:val="20"/>
               </w:rPr>
-              <w:t xml:space="preserve">Restores the configuration from before your last APPLY — straight back to DHCP if that is where you came from.</w:t>
+              <w:t xml:space="preserve">Undoes your last APPLY: back to exactly what the card had before it, DHCP included. Press it again after a second APPLY and you step back one more.</w:t>
             </w:r>
           </w:p>
         </w:tc>
@@ -1749,7 +1819,7 @@
                 <w:sz w:val="20"/>
                 <w:szCs w:val="20"/>
               </w:rPr>
-              <w:t xml:space="preserve">COPY COMMANDS</w:t>
+              <w:t xml:space="preserve">↩ RESTORE LAUNCH STATE</w:t>
             </w:r>
           </w:p>
         </w:tc>
@@ -1775,7 +1845,7 @@
                 <w:sz w:val="20"/>
                 <w:szCs w:val="20"/>
               </w:rPr>
-              <w:t xml:space="preserve">Shows the exact netsh commands without running them, with a COPY button for an admin prompt.</w:t>
+              <w:t xml:space="preserve">Puts every adapter back to how it was when the app started.</w:t>
             </w:r>
           </w:p>
         </w:tc>
@@ -1806,6 +1876,63 @@
                 <w:sz w:val="20"/>
                 <w:szCs w:val="20"/>
               </w:rPr>
+              <w:t xml:space="preserve">COPY COMMANDS</w:t>
+            </w:r>
+          </w:p>
+        </w:tc>
+        <w:tc>
+          <w:tcPr>
+            <w:tcW w:type="dxa" w:w="7480"/>
+            <w:tcMar>
+              <w:top w:type="dxa" w:w="60"/>
+              <w:left w:type="dxa" w:w="100"/>
+              <w:bottom w:type="dxa" w:w="60"/>
+              <w:right w:type="dxa" w:w="100"/>
+            </w:tcMar>
+          </w:tcPr>
+          <w:p>
+            <w:pPr>
+              <w:spacing w:after="0" w:line="260"/>
+            </w:pPr>
+            <w:r>
+              <w:rPr>
+                <w:rFonts w:ascii="Calibri" w:cs="Calibri" w:eastAsia="Calibri" w:hAnsi="Calibri"/>
+                <w:b w:val="false"/>
+                <w:bCs w:val="false"/>
+                <w:sz w:val="20"/>
+                <w:szCs w:val="20"/>
+              </w:rPr>
+              <w:t xml:space="preserve">Shows the exact netsh commands without running them, with a COPY button for an admin prompt.</w:t>
+            </w:r>
+          </w:p>
+        </w:tc>
+      </w:tr>
+      <w:tr>
+        <w:trPr>
+          <w:tblHeader w:val="off"/>
+        </w:trPr>
+        <w:tc>
+          <w:tcPr>
+            <w:tcW w:type="dxa" w:w="2600"/>
+            <w:tcMar>
+              <w:top w:type="dxa" w:w="60"/>
+              <w:left w:type="dxa" w:w="100"/>
+              <w:bottom w:type="dxa" w:w="60"/>
+              <w:right w:type="dxa" w:w="100"/>
+            </w:tcMar>
+          </w:tcPr>
+          <w:p>
+            <w:pPr>
+              <w:spacing w:after="0" w:line="260"/>
+            </w:pPr>
+            <w:r>
+              <w:rPr>
+                <w:rFonts w:ascii="Calibri" w:cs="Calibri" w:eastAsia="Calibri" w:hAnsi="Calibri"/>
+                <w:b w:val="false"/>
+                <w:bCs w:val="false"/>
+                <w:sz w:val="20"/>
+                <w:szCs w:val="20"/>
+              </w:rPr>
               <w:t xml:space="preserve">MTU → 1500</w:t>
             </w:r>
           </w:p>
@@ -1919,35 +2046,55 @@
           <w:sz w:val="22"/>
           <w:szCs w:val="22"/>
         </w:rPr>
-        <w:t xml:space="preserve">If the adapter is on DHCP, adding a multi-IP converts it to static (keeping its current lease values). The button asks for a second click before doing that.</w:t>
-      </w:r>
-    </w:p>
-    <w:p>
-      <w:pPr>
-        <w:pStyle w:val="ListParagraph"/>
-        <w:numPr>
-          <w:ilvl w:val="0"/>
-          <w:numId w:val="2"/>
-        </w:numPr>
-        <w:spacing w:after="80" w:line="276"/>
+        <w:t xml:space="preserve">If the adapter is on DHCP, adding a multi-IP converts it to static on its current address, keeping the gateway and DNS, and says so. One click.</w:t>
+      </w:r>
+    </w:p>
+    <w:p>
+      <w:pPr>
+        <w:pStyle w:val="ListParagraph"/>
+        <w:numPr>
+          <w:ilvl w:val="0"/>
+          <w:numId w:val="2"/>
+        </w:numPr>
+        <w:spacing w:after="80" w:line="276"/>
+      </w:pPr>
+      <w:r>
+        <w:rPr>
+          <w:rFonts w:ascii="Calibri" w:cs="Calibri" w:eastAsia="Calibri" w:hAnsi="Calibri"/>
+          <w:sz w:val="22"/>
+          <w:szCs w:val="22"/>
+        </w:rPr>
+        <w:t xml:space="preserve">Collapsed, the MULTI-IP bar shows how many extra addresses the card has (+1 IP). Windows keeps them across reboots until you remove them.</w:t>
+      </w:r>
+    </w:p>
+    <w:p>
+      <w:pPr>
+        <w:pStyle w:val="Heading2"/>
+        <w:spacing w:after="100" w:before="240"/>
       </w:pPr>
       <w:r>
         <w:rPr>
           <w:rFonts w:ascii="Calibri" w:cs="Calibri" w:eastAsia="Calibri" w:hAnsi="Calibri"/>
           <w:b/>
           <w:bCs/>
-          <w:sz w:val="22"/>
-          <w:szCs w:val="22"/>
-        </w:rPr>
-        <w:t xml:space="preserve">Remove multi-IPs before you leave.</w:t>
-      </w:r>
-      <w:r>
-        <w:rPr>
-          <w:rFonts w:ascii="Calibri" w:cs="Calibri" w:eastAsia="Calibri" w:hAnsi="Calibri"/>
-          <w:sz w:val="22"/>
-          <w:szCs w:val="22"/>
-        </w:rPr>
-        <w:t xml:space="preserve"> Windows keeps them across reboots, and the app warns you if any are still active when you hide or quit.</w:t>
+          <w:color w:val="222222"/>
+          <w:sz w:val="26"/>
+          <w:szCs w:val="26"/>
+        </w:rPr>
+        <w:t xml:space="preserve">Leftovers</w:t>
+      </w:r>
+    </w:p>
+    <w:p>
+      <w:pPr>
+        <w:spacing w:after="120" w:line="276"/>
+      </w:pPr>
+      <w:r>
+        <w:rPr>
+          <w:rFonts w:ascii="Calibri" w:cs="Calibri" w:eastAsia="Calibri" w:hAnsi="Calibri"/>
+          <w:sz w:val="22"/>
+          <w:szCs w:val="22"/>
+        </w:rPr>
+        <w:t xml:space="preserve">If the last session left a card static, or with extra addresses it didn't have before, one amber line under the ADAPTER says so on the next launch, for example "Last session left static 192.168.0.1 on this card (it was DHCP)". ↩ PUT BACK returns the card to how it was; KEEP leaves it and the line goes away. Change the card yourself and the line clears on its own.</w:t>
       </w:r>
     </w:p>
     <w:p>
@@ -2050,7 +2197,7 @@
           <w:sz w:val="22"/>
           <w:szCs w:val="22"/>
         </w:rPr>
-        <w:t xml:space="preserve"> — the address the laptop answers DHCP from. Devices get addresses next to it, and it is how you reach them afterwards. Each address on the card is a chip; the selected one is filled in. No address? SET LAPTOP IP… gives the card one (192.168.0.1 by default — the factory subnet most of our gear expects — duplicate-checked on the wire, moved to the next if taken, reverted when you quit). + ALIAS adds a second, temporary address to hand out on another subnet while the laptop keeps its own.</w:t>
+        <w:t xml:space="preserve"> — the address the laptop answers DHCP from. Devices get addresses next to it, and it is how you reach them afterwards. Each address on the card is a chip; the selected one is filled in. No address? SET LAPTOP IP… gives the card one (192.168.0.1 by default — the factory subnet most of our gear expects — duplicate-checked on the wire, moved to the next if taken). + ALIAS adds a second address to hand out on another subnet while the laptop keeps its own. Both stay until you change them, like an APPLY. With no cable in, the card line says the address is saved and used when the cable is in, and the pool is planned from it.</w:t>
       </w:r>
     </w:p>
     <w:p>
@@ -2312,6 +2459,24 @@
           <w:szCs w:val="22"/>
         </w:rPr>
         <w:t xml:space="preserve">A device that comes back gets the address it had before, for up to an hour. ★ on a row pins a device to a fixed address permanently.</w:t>
+      </w:r>
+    </w:p>
+    <w:p>
+      <w:pPr>
+        <w:pStyle w:val="ListParagraph"/>
+        <w:numPr>
+          <w:ilvl w:val="0"/>
+          <w:numId w:val="2"/>
+        </w:numPr>
+        <w:spacing w:after="80" w:line="276"/>
+      </w:pPr>
+      <w:r>
+        <w:rPr>
+          <w:rFonts w:ascii="Calibri" w:cs="Calibri" w:eastAsia="Calibri" w:hAnsi="Calibri"/>
+          <w:sz w:val="22"/>
+          <w:szCs w:val="22"/>
+        </w:rPr>
+        <w:t xml:space="preserve">Closing the lid pauses the engine; it picks up where it was a few seconds after wake.</w:t>
       </w:r>
     </w:p>
     <w:p>
@@ -2476,7 +2641,7 @@
                 <w:sz w:val="20"/>
                 <w:szCs w:val="20"/>
               </w:rPr>
-              <w:t xml:space="preserve">Which cable, and the laptop's address on it (chips). SET LAPTOP IP… and + ALIAS add an address — both temporary, reverted when you quit and recovered on the next launch after a force-close.</w:t>
+              <w:t xml:space="preserve">Which cable, and the laptop's address on it (chips). SET LAPTOP IP… and + ALIAS add an address that stays until you change it (→ DHCP or MULTI-IP on the IP tab).</w:t>
             </w:r>
           </w:p>
         </w:tc>
@@ -3098,7 +3263,7 @@
           <w:sz w:val="22"/>
           <w:szCs w:val="22"/>
         </w:rPr>
-        <w:t xml:space="preserve">PAUSE freezes the display and keeps the data; STOP clears everything.</w:t>
+        <w:t xml:space="preserve">PAUSE freezes the display and keeps the data; STOP clears everything. Closing the lid pauses a running monitor (PAUSED — LAPTOP ASLEEP) and waking resumes it.</w:t>
       </w:r>
     </w:p>
     <w:p>
@@ -3182,7 +3347,7 @@
           <w:sz w:val="22"/>
           <w:szCs w:val="22"/>
         </w:rPr>
-        <w:t xml:space="preserve">Each row shows IP, MAC, response time, hostname, vendor, open ports and — when the device answered discovery — a badge (ONVIF, SSDP, mDNS) with its name, model and URLs in the tooltip. Your own laptop is marked SELF. IP, MAC, PING and WSHARK copy, hand the device to the monitor, or open a Wireshark capture filtered to it. A row found by discovery alone shows the source where the response time would be.</w:t>
+        <w:t xml:space="preserve">Each row shows IP, MAC, response time, hostname, vendor, open ports and — when the device answered discovery — a badge (ONVIF, SSDP, mDNS) with its name, model and URLs in the tooltip. Your own laptop is marked SELF. IP, MAC, PING and WSHARK copy, hand the device to the monitor, or open a Wireshark capture filtered to it. A row found by discovery alone shows the source where the response time would be. Rows that answered discovery have a violet frame, and the ◎ N DISCOVERY chip in the header shows only those.</w:t>
       </w:r>
     </w:p>
     <w:p>
@@ -4426,7 +4591,7 @@
           <w:sz w:val="22"/>
           <w:szCs w:val="22"/>
         </w:rPr>
-        <w:t xml:space="preserve"> — how long one bare process launch (cmd /c ver) takes on this laptop, timed at start-up, with a verdict, plus how many launches the app has made and the slowest. Endpoint security inspects every launch; on a healthy box it is tens of milliseconds, on a managed laptop a few hundred, and over a second means every action that runs a command will lag — the first number to read on an "it's slow" report. PS WORKER shows the one PowerShell the app keeps open for its read-only queries.</w:t>
+        <w:t xml:space="preserve"> — how long one bare process launch (cmd /c ver) takes on this laptop, timed at start-up, with a verdict, plus how many launches the app has made and the slowest. Endpoint security inspects every launch; on a healthy box it is tens of milliseconds, on a managed laptop a few hundred, and over a second means every action that runs a command will lag — the first number to read on an "it's slow" report. PS WORKER shows the one PowerShell the app keeps open for its queries (all read-only, except clearing a saved static address when a card with no cable goes back to DHCP).</w:t>
       </w:r>
     </w:p>
     <w:p>
@@ -4463,6 +4628,24 @@
           <w:szCs w:val="22"/>
         </w:rPr>
         <w:t xml:space="preserve">COPY DIAGNOSTICS — puts a plain-text report on the clipboard.</w:t>
+      </w:r>
+    </w:p>
+    <w:p>
+      <w:pPr>
+        <w:pStyle w:val="ListParagraph"/>
+        <w:numPr>
+          <w:ilvl w:val="0"/>
+          <w:numId w:val="2"/>
+        </w:numPr>
+        <w:spacing w:after="80" w:line="276"/>
+      </w:pPr>
+      <w:r>
+        <w:rPr>
+          <w:rFonts w:ascii="Calibri" w:cs="Calibri" w:eastAsia="Calibri" w:hAnsi="Calibri"/>
+          <w:sz w:val="22"/>
+          <w:szCs w:val="22"/>
+        </w:rPr>
+        <w:t xml:space="preserve">If a data file (sites, presets, the site database) can't be read at launch, it is copied aside, never overwritten, and a notice says where it went. Saved sites are backed up automatically (first save of the day, before an import, before anything would empty the database).</w:t>
       </w:r>
     </w:p>
     <w:p>
@@ -4557,7 +4740,7 @@
           <w:sz w:val="22"/>
           <w:szCs w:val="22"/>
         </w:rPr>
-        <w:t xml:space="preserve">DHCP tab. ① pick the card; ② SET LAPTOP IP… if it has no address (192.168.0.1). Cameras appear as they ask: type the address each should end up on, ▶ SERVE, ↗ OPEN, set it static, next row. SERVE EVERYONE… if you just want them all to have an address. Quit when done — the laptop's adapter goes back the way it was.</w:t>
+        <w:t xml:space="preserve">DHCP tab. ① pick the card; ② SET LAPTOP IP… if it has no address (192.168.0.1). Cameras appear as they ask: type the address each should end up on, ▶ SERVE, ↗ OPEN, set it static, next row. SERVE EVERYONE… if you just want them all to have an address. Quit when done. The laptop keeps the address you gave it; next launch offers ↩ PUT BACK.</w:t>
       </w:r>
     </w:p>
     <w:p>
@@ -4617,7 +4800,7 @@
           <w:sz w:val="22"/>
           <w:szCs w:val="22"/>
         </w:rPr>
-        <w:t xml:space="preserve">DHCP tab: a camera on its fallback address shows as ◇ SITTING with its model, even though your laptop is on another subnet. ⇢ REACH gives the laptop a temporary address next to it and opens its web page. (SCAN → DISCOVER and REACH do the same from the SCAN tab.) Give it its real address, then REMOVE on the chip (or just quit).</w:t>
+        <w:t xml:space="preserve">DHCP tab: a camera on its fallback address shows as ◇ SITTING with its model, even though your laptop is on another subnet. ⇢ REACH gives the laptop a temporary address next to it and opens its web page. (SCAN → DISCOVER and REACH do the same from the SCAN tab.) Give it its real address, then REMOVE on the chip (or just quit — REACH addresses are temporary).</w:t>
       </w:r>
     </w:p>
     <w:p>
@@ -5225,21 +5408,6 @@
   <w:style w:type="paragraph" w:styleId="Normal" w:default="1">
     <w:name w:val="Normal"/>
     <w:qFormat/>
-  </w:style>
-  <w:style w:type="table" w:styleId="TableNormal" w:default="true">
-    <w:name w:val="Normal Table"/>
-    <w:uiPriority w:val="99"/>
-    <w:semiHidden/>
-    <w:unhideWhenUsed/>
-    <w:tblPr>
-      <w:tblInd w:type="dxa" w:w="0"/>
-      <w:tblCellMar>
-        <w:top w:type="dxa" w:w="0"/>
-        <w:left w:type="dxa" w:w="108"/>
-        <w:bottom w:type="dxa" w:w="0"/>
-        <w:right w:type="dxa" w:w="108"/>
-      </w:tblCellMar>
-    </w:tblPr>
   </w:style>
   <w:style w:type="paragraph" w:styleId="Title">
     <w:name w:val="Title"/>
@@ -5328,139 +5496,6 @@
     <w:basedOn w:val="Normal"/>
     <w:qFormat/>
   </w:style>
-  <w:style w:type="paragraph" w:styleId="Caption">
-    <w:name w:val="caption"/>
-    <w:basedOn w:val="Normal"/>
-    <w:next w:val="Normal"/>
-    <w:uiPriority w:val="35"/>
-    <w:semiHidden/>
-    <w:unhideWhenUsed/>
-    <w:qFormat/>
-    <w:pPr>
-      <w:spacing w:after="200"/>
-    </w:pPr>
-    <w:rPr>
-      <w:i/>
-      <w:iCs/>
-      <w:color w:val="44546A" w:themeColor="dark2"/>
-      <w:sz w:val="18"/>
-      <w:szCs w:val="18"/>
-    </w:rPr>
-  </w:style>
-  <w:style w:type="paragraph" w:styleId="Bibliography">
-    <w:name w:val="Bibliography"/>
-    <w:basedOn w:val="Normal"/>
-    <w:next w:val="Normal"/>
-    <w:uiPriority w:val="37"/>
-    <w:unhideWhenUsed/>
-  </w:style>
-  <w:style w:type="paragraph" w:styleId="TOC1">
-    <w:name w:val="toc 1"/>
-    <w:basedOn w:val="Normal"/>
-    <w:next w:val="Normal"/>
-    <w:uiPriority w:val="39"/>
-    <w:semiHidden/>
-    <w:unhideWhenUsed/>
-    <w:pPr>
-      <w:spacing w:after="100"/>
-    </w:pPr>
-  </w:style>
-  <w:style w:type="paragraph" w:styleId="TOC2">
-    <w:name w:val="toc 2"/>
-    <w:basedOn w:val="Normal"/>
-    <w:next w:val="Normal"/>
-    <w:uiPriority w:val="39"/>
-    <w:semiHidden/>
-    <w:unhideWhenUsed/>
-    <w:pPr>
-      <w:spacing w:after="100"/>
-      <w:ind w:left="220"/>
-    </w:pPr>
-  </w:style>
-  <w:style w:type="paragraph" w:styleId="TOC3">
-    <w:name w:val="toc 3"/>
-    <w:basedOn w:val="Normal"/>
-    <w:next w:val="Normal"/>
-    <w:uiPriority w:val="39"/>
-    <w:semiHidden/>
-    <w:unhideWhenUsed/>
-    <w:pPr>
-      <w:spacing w:after="100"/>
-      <w:ind w:left="440"/>
-    </w:pPr>
-  </w:style>
-  <w:style w:type="paragraph" w:styleId="TOC4">
-    <w:name w:val="toc 4"/>
-    <w:basedOn w:val="Normal"/>
-    <w:next w:val="Normal"/>
-    <w:uiPriority w:val="39"/>
-    <w:semiHidden/>
-    <w:unhideWhenUsed/>
-    <w:pPr>
-      <w:spacing w:after="100"/>
-      <w:ind w:left="660"/>
-    </w:pPr>
-  </w:style>
-  <w:style w:type="paragraph" w:styleId="TOC5">
-    <w:name w:val="toc 5"/>
-    <w:basedOn w:val="Normal"/>
-    <w:next w:val="Normal"/>
-    <w:uiPriority w:val="39"/>
-    <w:semiHidden/>
-    <w:unhideWhenUsed/>
-    <w:pPr>
-      <w:spacing w:after="100"/>
-      <w:ind w:left="880"/>
-    </w:pPr>
-  </w:style>
-  <w:style w:type="paragraph" w:styleId="TOC6">
-    <w:name w:val="toc 6"/>
-    <w:basedOn w:val="Normal"/>
-    <w:next w:val="Normal"/>
-    <w:uiPriority w:val="39"/>
-    <w:semiHidden/>
-    <w:unhideWhenUsed/>
-    <w:pPr>
-      <w:spacing w:after="100"/>
-      <w:ind w:left="1100"/>
-    </w:pPr>
-  </w:style>
-  <w:style w:type="paragraph" w:styleId="TOC7">
-    <w:name w:val="toc 7"/>
-    <w:basedOn w:val="Normal"/>
-    <w:next w:val="Normal"/>
-    <w:uiPriority w:val="39"/>
-    <w:semiHidden/>
-    <w:unhideWhenUsed/>
-    <w:pPr>
-      <w:spacing w:after="100"/>
-      <w:ind w:left="1320"/>
-    </w:pPr>
-  </w:style>
-  <w:style w:type="paragraph" w:styleId="TOC8">
-    <w:name w:val="toc 8"/>
-    <w:basedOn w:val="Normal"/>
-    <w:next w:val="Normal"/>
-    <w:uiPriority w:val="39"/>
-    <w:semiHidden/>
-    <w:unhideWhenUsed/>
-    <w:pPr>
-      <w:spacing w:after="100"/>
-      <w:ind w:left="1540"/>
-    </w:pPr>
-  </w:style>
-  <w:style w:type="paragraph" w:styleId="TOC9">
-    <w:name w:val="toc 9"/>
-    <w:basedOn w:val="Normal"/>
-    <w:next w:val="Normal"/>
-    <w:uiPriority w:val="39"/>
-    <w:semiHidden/>
-    <w:unhideWhenUsed/>
-    <w:pPr>
-      <w:spacing w:after="100"/>
-      <w:ind w:left="1760"/>
-    </w:pPr>
-  </w:style>
   <w:style w:type="character" w:styleId="Hyperlink">
     <w:name w:val="Hyperlink"/>
     <w:basedOn w:val="DefaultParagraphFont"/>
@@ -5544,13 +5579,6 @@
       <w:sz w:val="20"/>
       <w:szCs w:val="20"/>
     </w:rPr>
-  </w:style>
-  <w:style w:type="character" w:styleId="LineNumber">
-    <w:name w:val="line number"/>
-    <w:basedOn w:val="DefaultParagraphFont"/>
-    <w:uiPriority w:val="99"/>
-    <w:semiHidden/>
-    <w:unhideWhenUsed/>
   </w:style>
 </w:styles>
 </file>

</xml_diff>